<commit_message>
DEV-01: m_B and the 1 g test portion were both on the precision balance
Head of QC, 06.10.2026: the 1 g blended test portion was also weighed on
the precision balance (three decimals), so every pre-drying weighing (m_B
and G1, or m0 read after taring) was made on that one balance. DEV-01
states this instead of a tick box; with G2 on the same balance every
quantity in the result comes from one balance and the AUW220D serves
constant mass only. Decision rule unchanged. README, handover and
package bookmarks follow; LOD-01 and Attachment 1 are unchanged.

Co-Authored-By: Claude Opus 5.5 <noreply@anthropic.com>
Claude-Session: https://claude.ai/code/session_01DyBhj47i7bhaCyNMB1iwdv
</commit_message>
<xml_diff>
--- a/deliverables/qc_sampling_lod_2026-10/out/3_LOD_ANALYSIS_EXECUTION/PP-QC-SP-002_26-DEV-01_Deviation_Precision_Balance_LOD-01.docx
+++ b/deliverables/qc_sampling_lod_2026-10/out/3_LOD_ANALYSIS_EXECUTION/PP-QC-SP-002_26-DEV-01_Deviation_Precision_Balance_LOD-01.docx
@@ -51,7 +51,7 @@
           <w:color w:val="2B547E"/>
           <w:sz w:val="44"/>
         </w:rPr>
-        <w:t>Извештај за отстапување — G1 измерено на прецизна вага</w:t>
+        <w:t>Извештај за отстапување — мерења пред сушење на прецизна вага</w:t>
       </w:r>
     </w:p>
     <w:p>
@@ -67,7 +67,7 @@
           <w:color w:val="2B547E"/>
           <w:sz w:val="26"/>
         </w:rPr>
-        <w:t>Deviation report — G1 weighed on a precision balance</w:t>
+        <w:t>Deviation report — pre-drying weighings on a precision balance</w:t>
       </w:r>
     </w:p>
     <w:p>
@@ -1296,7 +1296,7 @@
           <w:color w:val="000000"/>
           <w:sz w:val="22"/>
         </w:rPr>
-        <w:t>Масата G1 (садот со тест порцијата пред сушење) за сите 46 порции на PP-QC-SP-002/26-LOD-01 е измерена на прецизна вага со d = 0,001 g (ID ____________) наместо на аналитичката вага Shimadzu AUW220D (d = 0,01 mg) што ја пропишува методот a02.2 (QCWI 016). Празниот сад m_B е измерен на: [ ] истата прецизна вага  [ ] AUW220D. Отстапувањето е откриено на 06.10.2026, за време на сушењето, пред мерењето по 24 h и пред секоја пресметка на резултат.</w:t>
+        <w:t>Мерењата пред сушење за сите 46 порции на PP-QC-SP-002/26-LOD-01 — празниот сад m_B и тест порцијата од 1,000 g сецкана, измешана дрога (G1, или m₀ отчитано по тарирање на садот) — се направени на прецизна вага со d = 0,001 g (ID ____________), со три децимали, наместо на аналитичката вага Shimadzu AUW220D (d = 0,01 mg) што ја пропишува методот a02.2 (QCWI 016). Отстапувањето е откриено на 06.10.2026, за време на сушењето, пред мерењето по 24 h и пред секоја пресметка на резултат.</w:t>
       </w:r>
       <w:r>
         <w:rPr>
@@ -1316,7 +1316,7 @@
           <w:color w:val="595959"/>
           <w:sz w:val="16"/>
         </w:rPr>
-        <w:t>The mass G1 (bottle with the test portion before drying) of all 46 portions of PP-QC-SP-002/26-LOD-01 was weighed on a precision balance with d = 0.001 g (ID ____________) instead of the Shimadzu AUW220D analytical balance (d = 0.01 mg) that method a02.2 requires (QCWI 016). The empty bottle m_B was weighed on: [ ] the same precision balance  [ ] the AUW220D. The deviation was found on 06.10.2026, during drying, before the 24-h weighing and before any result was calculated.</w:t>
+        <w:t>The pre-drying weighings of all 46 portions of PP-QC-SP-002/26-LOD-01 — the empty bottle m_B and the 1.000 g test portion of cut, blended drug (G1, or m₀ read after taring the bottle) — were made on a precision balance with d = 0.001 g (ID ____________), to three decimals, instead of the Shimadzu AUW220D analytical balance (d = 0.01 mg) that method a02.2 requires (QCWI 016). The deviation was found on 06.10.2026, during drying, before the 24-h weighing and before any result was calculated.</w:t>
       </w:r>
     </w:p>
     <w:p>
@@ -1380,7 +1380,7 @@
           <w:color w:val="000000"/>
           <w:sz w:val="22"/>
         </w:rPr>
-        <w:t>G2 и секое следно мерење се мерат на истата прецизна вага како G1 — оваа двојка го дава резултатот; разликата меѓу двете ваги така се поништува.</w:t>
+        <w:t>G2 и секое следно мерење се мерат на истата прецизна вага. Така сите величини во резултатот (m_B, G1 или m₀, G2) се од една вага и разликата меѓу двете ваги не влегува во резултатот.</w:t>
       </w:r>
       <w:r>
         <w:rPr>
@@ -1400,7 +1400,7 @@
           <w:color w:val="595959"/>
           <w:sz w:val="16"/>
         </w:rPr>
-        <w:t>G2 and every further weighing are made on the same precision balance as G1 — this pair gives the result, so any offset between the two balances cancels.</w:t>
+        <w:t>G2 and every further weighing are made on the same precision balance. Every quantity in the result (m_B, G1 or m₀, G2) then comes from one balance, so the offset between the two balances never enters the result.</w:t>
       </w:r>
     </w:p>
     <w:p>
@@ -1427,7 +1427,7 @@
           <w:color w:val="000000"/>
           <w:sz w:val="22"/>
         </w:rPr>
-        <w:t>Веднаш потоа истиот сад се мери и на AUW220D: константната маса (Δ ≤ 0,5 mg) се оценува само таму, затоа што вага со d = 1 mg не може да покаже разлика од 0,5 mg.</w:t>
+        <w:t>Веднаш потоа истиот сад се мери и на AUW220D, само за константната маса (Δ ≤ 0,5 mg), затоа што вага со d = 1 mg не може да покаже разлика од 0,5 mg.</w:t>
       </w:r>
       <w:r>
         <w:rPr>
@@ -1447,7 +1447,7 @@
           <w:color w:val="595959"/>
           <w:sz w:val="16"/>
         </w:rPr>
-        <w:t>Straight after, the same bottle is weighed on the AUW220D: constant mass (Δ ≤ 0.5 mg) is judged only there, since a balance with d = 1 mg cannot show a 0.5 mg difference.</w:t>
+        <w:t>Straight after, the same bottle is weighed on the AUW220D, for constant mass only (Δ ≤ 0.5 mg), since a balance with d = 1 mg cannot show a 0.5 mg difference.</w:t>
       </w:r>
     </w:p>
     <w:p>
@@ -1652,7 +1652,7 @@
           <w:color w:val="000000"/>
           <w:sz w:val="22"/>
         </w:rPr>
-        <w:t>Губитокот L = G1 − G2 е околу 50–125 mg на m₀ ≈ 1,000 g. Со двете мерења на иста вага, отстапувањето на вагата се поништува; остануваат читливоста d = 1 mg (u = d ÷ √12 по читање) и повторливоста s на вагата.</w:t>
+        <w:t>Губитокот L = G1 − G2 е околу 50–125 mg на m₀ ≈ 1,000 g. Со сите мерења на иста вага, отстапувањето на вагата се поништува; остануваат читливоста d = 1 mg (u = d ÷ √12 по читање) и повторливоста s на вагата.</w:t>
       </w:r>
       <w:r>
         <w:rPr>
@@ -1672,7 +1672,7 @@
           <w:color w:val="595959"/>
           <w:sz w:val="16"/>
         </w:rPr>
-        <w:t>The loss L = G1 − G2 is about 50–125 mg on m₀ ≈ 1.000 g. With both weighings on one balance its offset cancels; what remains is the readability d = 1 mg (u = d ÷ √12 per reading) and the balance repeatability s.</w:t>
+        <w:t>The loss L = G1 − G2 is about 50–125 mg on m₀ ≈ 1.000 g. With every weighing on one balance its offset cancels; what remains is the readability d = 1 mg (u = d ÷ √12 per reading) and the balance repeatability s.</w:t>
       </w:r>
     </w:p>
     <w:p>
@@ -1746,7 +1746,7 @@
           <w:color w:val="000000"/>
           <w:sz w:val="22"/>
         </w:rPr>
-        <w:t>m₀ е под влијание само околу 0,1 % релативно — занемарливо; Ph. Eur. дозволува вистинската маса да отстапува до 10 % од наведените 1,000 g.</w:t>
+        <w:t>Тест порцијата од 1,000 g е измерена на 1 mg: m₀ е под влијание само околу 0,1 % релативно — занемарливо и веќе опфатено со U; Ph. Eur. дозволува вистинската маса да отстапува до 10 % од наведените 1,000 g.</w:t>
       </w:r>
       <w:r>
         <w:rPr>
@@ -1766,7 +1766,7 @@
           <w:color w:val="595959"/>
           <w:sz w:val="16"/>
         </w:rPr>
-        <w:t>m₀ is affected by only about 0.1 % relative — negligible; Ph. Eur. allows the actual quantity to differ by up to 10 % from the 1.000 g stated.</w:t>
+        <w:t>The 1.000 g test portion was weighed to 1 mg: m₀ is affected by only about 0.1 % relative — negligible and already within U; Ph. Eur. allows the actual quantity to differ by up to 10 % from the 1.000 g stated.</w:t>
       </w:r>
     </w:p>
     <w:p>
@@ -4746,7 +4746,7 @@
               <w:szCs w:val="28"/>
               <w:lang w:val="mk-MK"/>
             </w:rPr>
-            <w:t>ИЗВЕШТАЈ ЗА ОТСТАПУВАЊЕ — МЕРЕЊЕ G1, LOD-01</w:t>
+            <w:t>ИЗВЕШТАЈ ЗА ОТСТАПУВАЊЕ — МЕРЕЊА ПРЕД СУШЕЊЕ, LOD-01</w:t>
           </w:r>
           <w:r>
             <w:rPr>
@@ -4786,7 +4786,7 @@
             <w:rPr>
               <w:rFonts w:ascii="Arial Narrow" w:hAnsi="Arial Narrow" w:cs="Arial Narrow"/>
             </w:rPr>
-            <w:t>DEVIATION REPORT — G1 WEIGHING, LOD-01</w:t>
+            <w:t>DEVIATION REPORT — PRE-DRYING WEIGHINGS, LOD-01</w:t>
           </w:r>
         </w:p>
       </w:tc>

</xml_diff>

<commit_message>
LOD-01R: repeat all 46 on the AUW220D; DEV-01 records the decision
Head of QC, 06.10.2026: the method needs a balance reading at least
4 decimals; run 1's m_B and G1 exist only to 1 mg and no later weighing
corrects that. Run 1 (LOD-01) is invalidated and all 46 batches are
repeated from the sample remainders, every weighing on the AUW220D.

- build_lod(repeat=True) builds PP-QC-SP-002/26-LOD-01R: retrieval of the
  remainders, AUW220D for m_B, G1 and G2 (d ticked), a new 1.000 g
  portion, and a note that the result replaces run 1 for every batch.
- DEV-01: decision section, a write-in on whether run-1 results were
  calculated before it, the earlier band rule kept as superseded, and
  blanks for the 46 two-balance G2 pairs as supporting data.
- Package 3, README and handover follow. LOD-01 and Attachment 1 are
  byte-identical.

Co-Authored-By: Claude Opus 5.5 <noreply@anthropic.com>
Claude-Session: https://claude.ai/code/session_01DyBhj47i7bhaCyNMB1iwdv
</commit_message>
<xml_diff>
--- a/deliverables/qc_sampling_lod_2026-10/out/3_LOD_ANALYSIS_EXECUTION/PP-QC-SP-002_26-DEV-01_Deviation_Precision_Balance_LOD-01.docx
+++ b/deliverables/qc_sampling_lod_2026-10/out/3_LOD_ANALYSIS_EXECUTION/PP-QC-SP-002_26-DEV-01_Deviation_Precision_Balance_LOD-01.docx
@@ -719,6 +719,95 @@
                 <w:sz w:val="20"/>
               </w:rPr>
               <w:t>____________ / ____________</w:t>
+            </w:r>
+          </w:p>
+        </w:tc>
+      </w:tr>
+      <w:tr>
+        <w:tc>
+          <w:tcPr>
+            <w:shd w:val="clear" w:color="auto" w:fill="F2F2F2"/>
+            <w:vAlign w:val="center"/>
+            <w:tcW w:type="dxa" w:w="3175"/>
+          </w:tcPr>
+          <w:p>
+            <w:pPr>
+              <w:spacing w:before="20" w:after="20"/>
+              <w:jc w:val="center"/>
+            </w:pPr>
+            <w:r/>
+            <w:r>
+              <w:rPr>
+                <w:rFonts w:ascii="Calibri" w:hAnsi="Calibri"/>
+                <w:b/>
+                <w:i w:val="0"/>
+                <w:color w:val="2B547E"/>
+                <w:sz w:val="20"/>
+              </w:rPr>
+              <w:t>Одлука</w:t>
+            </w:r>
+            <w:r>
+              <w:rPr>
+                <w:rFonts w:ascii="Calibri" w:hAnsi="Calibri"/>
+                <w:b w:val="0"/>
+                <w:i w:val="0"/>
+                <w:color w:val="2B547E"/>
+                <w:sz w:val="16"/>
+              </w:rPr>
+              <w:t xml:space="preserve"> | </w:t>
+            </w:r>
+            <w:r>
+              <w:rPr>
+                <w:rFonts w:ascii="Calibri" w:hAnsi="Calibri"/>
+                <w:b w:val="0"/>
+                <w:i w:val="0"/>
+                <w:color w:val="2B547E"/>
+                <w:sz w:val="16"/>
+              </w:rPr>
+              <w:t>Decision</w:t>
+            </w:r>
+          </w:p>
+        </w:tc>
+        <w:tc>
+          <w:tcPr>
+            <w:vAlign w:val="center"/>
+            <w:tcW w:type="dxa" w:w="7291"/>
+          </w:tcPr>
+          <w:p>
+            <w:pPr>
+              <w:spacing w:before="20" w:after="20"/>
+              <w:jc w:val="center"/>
+            </w:pPr>
+            <w:r/>
+            <w:r>
+              <w:rPr>
+                <w:rFonts w:ascii="Calibri" w:hAnsi="Calibri"/>
+                <w:b w:val="0"/>
+                <w:i w:val="0"/>
+                <w:color w:val="000000"/>
+                <w:sz w:val="20"/>
+              </w:rPr>
+              <w:t>сушењето 1 поништено; сите 46 серии повторени во PP-QC-SP-002/26-LOD-01R</w:t>
+            </w:r>
+            <w:r>
+              <w:rPr>
+                <w:rFonts w:ascii="Calibri" w:hAnsi="Calibri"/>
+                <w:b w:val="0"/>
+                <w:i w:val="0"/>
+                <w:color w:val="000000"/>
+                <w:sz w:val="16"/>
+              </w:rPr>
+              <w:t xml:space="preserve"> | </w:t>
+            </w:r>
+            <w:r>
+              <w:rPr>
+                <w:rFonts w:ascii="Calibri" w:hAnsi="Calibri"/>
+                <w:b w:val="0"/>
+                <w:i/>
+                <w:color w:val="000000"/>
+                <w:sz w:val="16"/>
+              </w:rPr>
+              <w:t>run 1 invalidated; all 46 batches repeated in PP-QC-SP-002/26-LOD-01R</w:t>
             </w:r>
           </w:p>
         </w:tc>
@@ -2339,7 +2428,7 @@
           <w:color w:val="595959"/>
           <w:sz w:val="20"/>
         </w:rPr>
-        <w:t>Правилото во делот D користи U = 0,3 % (s = 1 mg). Ако сертификатот за калибрација на прецизната вага дава s &gt; 1 mg, U се пресметува повторно и опсезите се прошируваат пред да се пресмета кој било резултат.</w:t>
+        <w:t>Пресметката покажува колку несигурен би бил резултатот од сушењето 1; по одлуката во делот D тој не се известува.</w:t>
       </w:r>
       <w:r>
         <w:rPr>
@@ -2359,607 +2448,7 @@
           <w:color w:val="595959"/>
           <w:sz w:val="16"/>
         </w:rPr>
-        <w:t>The rule in section D uses U = 0.3 % (s = 1 mg). If the precision balance's calibration certificate gives s &gt; 1 mg, U is recomputed and the bands widened before any result is calculated.</w:t>
-      </w:r>
-    </w:p>
-    <w:p>
-      <w:pPr>
-        <w:keepNext/>
-        <w:spacing w:before="240" w:after="140"/>
-        <w:outlineLvl w:val="0"/>
-      </w:pPr>
-      <w:r>
-        <w:rPr>
-          <w:rFonts w:ascii="Calibri" w:hAnsi="Calibri"/>
-          <w:b/>
-          <w:i w:val="0"/>
-          <w:color w:val="2B547E"/>
-          <w:sz w:val="40"/>
-        </w:rPr>
-        <w:t>D.  ПРАВИЛО ЗА ОДЛУКА (утврдено пред резултатите)</w:t>
-      </w:r>
-      <w:r>
-        <w:rPr>
-          <w:rFonts w:ascii="Calibri" w:hAnsi="Calibri"/>
-          <w:b w:val="0"/>
-          <w:i w:val="0"/>
-          <w:color w:val="595959"/>
-          <w:sz w:val="36"/>
-        </w:rPr>
-        <w:t xml:space="preserve">  |  </w:t>
-      </w:r>
-      <w:r>
-        <w:rPr>
-          <w:rFonts w:ascii="Calibri" w:hAnsi="Calibri"/>
-          <w:b w:val="0"/>
-          <w:i w:val="0"/>
-          <w:color w:val="595959"/>
-          <w:sz w:val="32"/>
-        </w:rPr>
-        <w:t>Decision Rule (fixed before the results)</w:t>
-      </w:r>
-    </w:p>
-    <w:tbl>
-      <w:tblPr>
-        <w:tblLook w:firstColumn="1" w:firstRow="1" w:lastColumn="0" w:lastRow="0" w:noHBand="0" w:noVBand="1" w:val="04A0"/>
-        <w:tblLayout w:type="fixed"/>
-        <w:tblW w:type="dxa" w:w="10466"/>
-        <w:tblInd w:type="dxa" w:w="0"/>
-        <w:jc w:val="center"/>
-        <w:tblBorders>
-          <w:top w:val="single" w:sz="4" w:space="0" w:color="2B547E"/>
-          <w:left w:val="single" w:sz="4" w:space="0" w:color="2B547E"/>
-          <w:bottom w:val="single" w:sz="4" w:space="0" w:color="2B547E"/>
-          <w:right w:val="single" w:sz="4" w:space="0" w:color="2B547E"/>
-          <w:insideH w:val="single" w:sz="4" w:space="0" w:color="2B547E"/>
-          <w:insideV w:val="single" w:sz="4" w:space="0" w:color="2B547E"/>
-        </w:tblBorders>
-      </w:tblPr>
-      <w:tblGrid>
-        <w:gridCol w:w="2381"/>
-        <w:gridCol w:w="8085"/>
-      </w:tblGrid>
-      <w:tr>
-        <w:tc>
-          <w:tcPr>
-            <w:shd w:val="clear" w:color="auto" w:fill="2B547E"/>
-            <w:vAlign w:val="center"/>
-            <w:tcW w:type="dxa" w:w="2381"/>
-          </w:tcPr>
-          <w:p>
-            <w:pPr>
-              <w:spacing w:before="20" w:after="20"/>
-              <w:jc w:val="center"/>
-            </w:pPr>
-            <w:r/>
-            <w:r>
-              <w:rPr>
-                <w:rFonts w:ascii="Calibri" w:hAnsi="Calibri"/>
-                <w:b/>
-                <w:i w:val="0"/>
-                <w:color w:val="FFFFFF"/>
-                <w:sz w:val="16"/>
-              </w:rPr>
-              <w:t>ГпС % (прецизна вага)</w:t>
-            </w:r>
-            <w:r>
-              <w:rPr>
-                <w:rFonts w:ascii="Calibri" w:hAnsi="Calibri"/>
-                <w:b w:val="0"/>
-                <w:i w:val="0"/>
-                <w:color w:val="FFFFFF"/>
-                <w:sz w:val="14"/>
-              </w:rPr>
-              <w:t xml:space="preserve"> | </w:t>
-            </w:r>
-            <w:r>
-              <w:rPr>
-                <w:rFonts w:ascii="Calibri" w:hAnsi="Calibri"/>
-                <w:b w:val="0"/>
-                <w:i w:val="0"/>
-                <w:color w:val="FFFFFF"/>
-                <w:sz w:val="14"/>
-              </w:rPr>
-              <w:t>LoD % (precision balance)</w:t>
-            </w:r>
-          </w:p>
-        </w:tc>
-        <w:tc>
-          <w:tcPr>
-            <w:shd w:val="clear" w:color="auto" w:fill="2B547E"/>
-            <w:vAlign w:val="center"/>
-            <w:tcW w:type="dxa" w:w="8085"/>
-          </w:tcPr>
-          <w:p>
-            <w:pPr>
-              <w:spacing w:before="20" w:after="20"/>
-              <w:jc w:val="center"/>
-            </w:pPr>
-            <w:r/>
-            <w:r>
-              <w:rPr>
-                <w:rFonts w:ascii="Calibri" w:hAnsi="Calibri"/>
-                <w:b/>
-                <w:i w:val="0"/>
-                <w:color w:val="FFFFFF"/>
-                <w:sz w:val="16"/>
-              </w:rPr>
-              <w:t>Одлука</w:t>
-            </w:r>
-            <w:r>
-              <w:rPr>
-                <w:rFonts w:ascii="Calibri" w:hAnsi="Calibri"/>
-                <w:b w:val="0"/>
-                <w:i w:val="0"/>
-                <w:color w:val="FFFFFF"/>
-                <w:sz w:val="14"/>
-              </w:rPr>
-              <w:t xml:space="preserve"> | </w:t>
-            </w:r>
-            <w:r>
-              <w:rPr>
-                <w:rFonts w:ascii="Calibri" w:hAnsi="Calibri"/>
-                <w:b w:val="0"/>
-                <w:i w:val="0"/>
-                <w:color w:val="FFFFFF"/>
-                <w:sz w:val="14"/>
-              </w:rPr>
-              <w:t>Decision</w:t>
-            </w:r>
-          </w:p>
-        </w:tc>
-      </w:tr>
-      <w:tr>
-        <w:tc>
-          <w:tcPr>
-            <w:vAlign w:val="center"/>
-            <w:tcW w:type="dxa" w:w="2381"/>
-          </w:tcPr>
-          <w:p>
-            <w:pPr>
-              <w:spacing w:before="20" w:after="20"/>
-              <w:jc w:val="center"/>
-            </w:pPr>
-            <w:r/>
-            <w:r>
-              <w:rPr>
-                <w:rFonts w:ascii="Calibri" w:hAnsi="Calibri"/>
-                <w:b/>
-                <w:i w:val="0"/>
-                <w:color w:val="000000"/>
-                <w:sz w:val="16"/>
-              </w:rPr>
-              <w:t>≤ 11,7</w:t>
-            </w:r>
-          </w:p>
-        </w:tc>
-        <w:tc>
-          <w:tcPr>
-            <w:vAlign w:val="center"/>
-            <w:tcW w:type="dxa" w:w="8085"/>
-          </w:tcPr>
-          <w:p>
-            <w:pPr>
-              <w:spacing w:before="20" w:after="20"/>
-              <w:jc w:val="left"/>
-            </w:pPr>
-            <w:r/>
-            <w:r>
-              <w:rPr>
-                <w:rFonts w:ascii="Calibri" w:hAnsi="Calibri"/>
-                <w:b w:val="0"/>
-                <w:i w:val="0"/>
-                <w:color w:val="000000"/>
-                <w:sz w:val="16"/>
-              </w:rPr>
-              <w:t>Одговара (≤ 12,0 % и со U = 0,3 %).</w:t>
-            </w:r>
-            <w:r>
-              <w:rPr>
-                <w:rFonts w:ascii="Calibri" w:hAnsi="Calibri"/>
-                <w:b w:val="0"/>
-                <w:i w:val="0"/>
-                <w:color w:val="000000"/>
-                <w:sz w:val="14"/>
-              </w:rPr>
-              <w:t xml:space="preserve"> | </w:t>
-            </w:r>
-            <w:r>
-              <w:rPr>
-                <w:rFonts w:ascii="Calibri" w:hAnsi="Calibri"/>
-                <w:b w:val="0"/>
-                <w:i/>
-                <w:color w:val="000000"/>
-                <w:sz w:val="14"/>
-              </w:rPr>
-              <w:t>Conforms (≤ 12.0 % even with U = 0.3 %).</w:t>
-            </w:r>
-          </w:p>
-        </w:tc>
-      </w:tr>
-      <w:tr>
-        <w:tc>
-          <w:tcPr>
-            <w:vAlign w:val="center"/>
-            <w:tcW w:type="dxa" w:w="2381"/>
-          </w:tcPr>
-          <w:p>
-            <w:pPr>
-              <w:spacing w:before="20" w:after="20"/>
-              <w:jc w:val="center"/>
-            </w:pPr>
-            <w:r/>
-            <w:r>
-              <w:rPr>
-                <w:rFonts w:ascii="Calibri" w:hAnsi="Calibri"/>
-                <w:b/>
-                <w:i w:val="0"/>
-                <w:color w:val="000000"/>
-                <w:sz w:val="16"/>
-              </w:rPr>
-              <w:t>11,8 – 12,3</w:t>
-            </w:r>
-          </w:p>
-        </w:tc>
-        <w:tc>
-          <w:tcPr>
-            <w:vAlign w:val="center"/>
-            <w:tcW w:type="dxa" w:w="8085"/>
-          </w:tcPr>
-          <w:p>
-            <w:pPr>
-              <w:spacing w:before="20" w:after="20"/>
-              <w:jc w:val="left"/>
-            </w:pPr>
-            <w:r/>
-            <w:r>
-              <w:rPr>
-                <w:rFonts w:ascii="Calibri" w:hAnsi="Calibri"/>
-                <w:b w:val="0"/>
-                <w:i w:val="0"/>
-                <w:color w:val="000000"/>
-                <w:sz w:val="16"/>
-              </w:rPr>
-              <w:t>Без одлука: повторување во целост по a02.2 на AUW220D од остатокот на примерокот (m_B, G1 и G2 на AUW220D); се известува повторениот резултат, двата остануваат во записот.</w:t>
-            </w:r>
-            <w:r>
-              <w:rPr>
-                <w:rFonts w:ascii="Calibri" w:hAnsi="Calibri"/>
-                <w:b w:val="0"/>
-                <w:i w:val="0"/>
-                <w:color w:val="000000"/>
-                <w:sz w:val="14"/>
-              </w:rPr>
-              <w:t xml:space="preserve"> | </w:t>
-            </w:r>
-            <w:r>
-              <w:rPr>
-                <w:rFonts w:ascii="Calibri" w:hAnsi="Calibri"/>
-                <w:b w:val="0"/>
-                <w:i/>
-                <w:color w:val="000000"/>
-                <w:sz w:val="14"/>
-              </w:rPr>
-              <w:t>No decision: full repeat per a02.2 on the AUW220D from the sample remainder (m_B, G1 and G2 on the AUW220D); the repeat is reported, both stay in the record.</w:t>
-            </w:r>
-          </w:p>
-        </w:tc>
-      </w:tr>
-      <w:tr>
-        <w:tc>
-          <w:tcPr>
-            <w:vAlign w:val="center"/>
-            <w:tcW w:type="dxa" w:w="2381"/>
-          </w:tcPr>
-          <w:p>
-            <w:pPr>
-              <w:spacing w:before="20" w:after="20"/>
-              <w:jc w:val="center"/>
-            </w:pPr>
-            <w:r/>
-            <w:r>
-              <w:rPr>
-                <w:rFonts w:ascii="Calibri" w:hAnsi="Calibri"/>
-                <w:b/>
-                <w:i w:val="0"/>
-                <w:color w:val="000000"/>
-                <w:sz w:val="16"/>
-              </w:rPr>
-              <w:t>&gt; 12,3</w:t>
-            </w:r>
-          </w:p>
-        </w:tc>
-        <w:tc>
-          <w:tcPr>
-            <w:vAlign w:val="center"/>
-            <w:tcW w:type="dxa" w:w="8085"/>
-          </w:tcPr>
-          <w:p>
-            <w:pPr>
-              <w:spacing w:before="20" w:after="20"/>
-              <w:jc w:val="left"/>
-            </w:pPr>
-            <w:r/>
-            <w:r>
-              <w:rPr>
-                <w:rFonts w:ascii="Calibri" w:hAnsi="Calibri"/>
-                <w:b w:val="0"/>
-                <w:i w:val="0"/>
-                <w:color w:val="000000"/>
-                <w:sz w:val="16"/>
-              </w:rPr>
-              <w:t>OOS по QCSOP 014: грешката на вагата не може да ја објасни разликата.</w:t>
-            </w:r>
-            <w:r>
-              <w:rPr>
-                <w:rFonts w:ascii="Calibri" w:hAnsi="Calibri"/>
-                <w:b w:val="0"/>
-                <w:i w:val="0"/>
-                <w:color w:val="000000"/>
-                <w:sz w:val="14"/>
-              </w:rPr>
-              <w:t xml:space="preserve"> | </w:t>
-            </w:r>
-            <w:r>
-              <w:rPr>
-                <w:rFonts w:ascii="Calibri" w:hAnsi="Calibri"/>
-                <w:b w:val="0"/>
-                <w:i/>
-                <w:color w:val="000000"/>
-                <w:sz w:val="14"/>
-              </w:rPr>
-              <w:t>OOS per QCSOP 014: the balance error cannot explain the difference.</w:t>
-            </w:r>
-          </w:p>
-        </w:tc>
-      </w:tr>
-    </w:tbl>
-    <w:p>
-      <w:pPr>
-        <w:spacing w:before="90" w:after="90"/>
-        <w:jc w:val="both"/>
-      </w:pPr>
-      <w:r>
-        <w:rPr>
-          <w:rFonts w:ascii="Calibri" w:hAnsi="Calibri"/>
-          <w:b w:val="0"/>
-          <w:i/>
-          <w:color w:val="595959"/>
-          <w:sz w:val="20"/>
-        </w:rPr>
-        <w:t>Правилото важи непроменето за сите 46 серии.</w:t>
-      </w:r>
-      <w:r>
-        <w:rPr>
-          <w:rFonts w:ascii="Calibri" w:hAnsi="Calibri"/>
-          <w:b w:val="0"/>
-          <w:i w:val="0"/>
-          <w:color w:val="595959"/>
-          <w:sz w:val="16"/>
-        </w:rPr>
-        <w:t xml:space="preserve">  |  </w:t>
-      </w:r>
-      <w:r>
-        <w:rPr>
-          <w:rFonts w:ascii="Calibri" w:hAnsi="Calibri"/>
-          <w:b w:val="0"/>
-          <w:i/>
-          <w:color w:val="595959"/>
-          <w:sz w:val="16"/>
-        </w:rPr>
-        <w:t>The rule applies unchanged to all 46 batches.</w:t>
-      </w:r>
-    </w:p>
-    <w:p>
-      <w:pPr>
-        <w:keepNext/>
-        <w:spacing w:before="240" w:after="140"/>
-        <w:outlineLvl w:val="0"/>
-      </w:pPr>
-      <w:r>
-        <w:rPr>
-          <w:rFonts w:ascii="Calibri" w:hAnsi="Calibri"/>
-          <w:b/>
-          <w:i w:val="0"/>
-          <w:color w:val="2B547E"/>
-          <w:sz w:val="40"/>
-        </w:rPr>
-        <w:t>E.  ПРИЧИНА</w:t>
-      </w:r>
-      <w:r>
-        <w:rPr>
-          <w:rFonts w:ascii="Calibri" w:hAnsi="Calibri"/>
-          <w:b w:val="0"/>
-          <w:i w:val="0"/>
-          <w:color w:val="595959"/>
-          <w:sz w:val="36"/>
-        </w:rPr>
-        <w:t xml:space="preserve">  |  </w:t>
-      </w:r>
-      <w:r>
-        <w:rPr>
-          <w:rFonts w:ascii="Calibri" w:hAnsi="Calibri"/>
-          <w:b w:val="0"/>
-          <w:i w:val="0"/>
-          <w:color w:val="595959"/>
-          <w:sz w:val="32"/>
-        </w:rPr>
-        <w:t>Root Cause</w:t>
-      </w:r>
-    </w:p>
-    <w:tbl>
-      <w:tblPr>
-        <w:tblLook w:firstColumn="1" w:firstRow="1" w:lastColumn="0" w:lastRow="0" w:noHBand="0" w:noVBand="1" w:val="04A0"/>
-        <w:tblLayout w:type="fixed"/>
-        <w:tblW w:type="dxa" w:w="10466"/>
-        <w:tblInd w:type="dxa" w:w="0"/>
-        <w:jc w:val="center"/>
-        <w:tblBorders>
-          <w:top w:val="single" w:sz="4" w:space="0" w:color="2B547E"/>
-          <w:left w:val="single" w:sz="4" w:space="0" w:color="2B547E"/>
-          <w:bottom w:val="single" w:sz="4" w:space="0" w:color="2B547E"/>
-          <w:right w:val="single" w:sz="4" w:space="0" w:color="2B547E"/>
-          <w:insideH w:val="single" w:sz="4" w:space="0" w:color="2B547E"/>
-          <w:insideV w:val="single" w:sz="4" w:space="0" w:color="2B547E"/>
-        </w:tblBorders>
-      </w:tblPr>
-      <w:tblGrid>
-        <w:gridCol w:w="10466"/>
-      </w:tblGrid>
-      <w:tr>
-        <w:tc>
-          <w:tcPr>
-            <w:shd w:val="clear" w:color="auto" w:fill="2B547E"/>
-            <w:vAlign w:val="center"/>
-            <w:tcW w:type="dxa" w:w="10466"/>
-          </w:tcPr>
-          <w:p>
-            <w:pPr>
-              <w:spacing w:before="20" w:after="20"/>
-              <w:jc w:val="center"/>
-            </w:pPr>
-            <w:r/>
-            <w:r>
-              <w:rPr>
-                <w:rFonts w:ascii="Calibri" w:hAnsi="Calibri"/>
-                <w:b/>
-                <w:i w:val="0"/>
-                <w:color w:val="FFFFFF"/>
-                <w:sz w:val="16"/>
-              </w:rPr>
-              <w:t>Утврдува QA</w:t>
-            </w:r>
-            <w:r>
-              <w:rPr>
-                <w:rFonts w:ascii="Calibri" w:hAnsi="Calibri"/>
-                <w:b w:val="0"/>
-                <w:i w:val="0"/>
-                <w:color w:val="FFFFFF"/>
-                <w:sz w:val="14"/>
-              </w:rPr>
-              <w:t xml:space="preserve"> | </w:t>
-            </w:r>
-            <w:r>
-              <w:rPr>
-                <w:rFonts w:ascii="Calibri" w:hAnsi="Calibri"/>
-                <w:b w:val="0"/>
-                <w:i w:val="0"/>
-                <w:color w:val="FFFFFF"/>
-                <w:sz w:val="14"/>
-              </w:rPr>
-              <w:t>Determined by QA</w:t>
-            </w:r>
-          </w:p>
-        </w:tc>
-      </w:tr>
-      <w:tr>
-        <w:trPr>
-          <w:trHeight w:val="453" w:hRule="atLeast"/>
-        </w:trPr>
-        <w:tc>
-          <w:tcPr>
-            <w:vAlign w:val="center"/>
-            <w:tcW w:type="dxa" w:w="10466"/>
-          </w:tcPr>
-          <w:p>
-            <w:pPr>
-              <w:spacing w:before="20" w:after="20"/>
-              <w:jc w:val="center"/>
-            </w:pPr>
-            <w:r/>
-          </w:p>
-        </w:tc>
-      </w:tr>
-      <w:tr>
-        <w:trPr>
-          <w:trHeight w:val="453" w:hRule="atLeast"/>
-        </w:trPr>
-        <w:tc>
-          <w:tcPr>
-            <w:vAlign w:val="center"/>
-            <w:tcW w:type="dxa" w:w="10466"/>
-          </w:tcPr>
-          <w:p>
-            <w:pPr>
-              <w:spacing w:before="20" w:after="20"/>
-              <w:jc w:val="center"/>
-            </w:pPr>
-            <w:r/>
-          </w:p>
-        </w:tc>
-      </w:tr>
-      <w:tr>
-        <w:trPr>
-          <w:trHeight w:val="453" w:hRule="atLeast"/>
-        </w:trPr>
-        <w:tc>
-          <w:tcPr>
-            <w:vAlign w:val="center"/>
-            <w:tcW w:type="dxa" w:w="10466"/>
-          </w:tcPr>
-          <w:p>
-            <w:pPr>
-              <w:spacing w:before="20" w:after="20"/>
-              <w:jc w:val="center"/>
-            </w:pPr>
-            <w:r/>
-          </w:p>
-        </w:tc>
-      </w:tr>
-      <w:tr>
-        <w:trPr>
-          <w:trHeight w:val="453" w:hRule="atLeast"/>
-        </w:trPr>
-        <w:tc>
-          <w:tcPr>
-            <w:vAlign w:val="center"/>
-            <w:tcW w:type="dxa" w:w="10466"/>
-          </w:tcPr>
-          <w:p>
-            <w:pPr>
-              <w:spacing w:before="20" w:after="20"/>
-              <w:jc w:val="center"/>
-            </w:pPr>
-            <w:r/>
-          </w:p>
-        </w:tc>
-      </w:tr>
-    </w:tbl>
-    <w:p>
-      <w:pPr>
-        <w:keepNext/>
-        <w:spacing w:before="240" w:after="140"/>
-        <w:outlineLvl w:val="0"/>
-      </w:pPr>
-      <w:r>
-        <w:rPr>
-          <w:rFonts w:ascii="Calibri" w:hAnsi="Calibri"/>
-          <w:b/>
-          <w:i w:val="0"/>
-          <w:color w:val="2B547E"/>
-          <w:sz w:val="40"/>
-        </w:rPr>
-        <w:t>F.  КОРЕКТИВНИ И ПРЕВЕНТИВНИ ДЕЈСТВА (предлог)</w:t>
-      </w:r>
-      <w:r>
-        <w:rPr>
-          <w:rFonts w:ascii="Calibri" w:hAnsi="Calibri"/>
-          <w:b w:val="0"/>
-          <w:i w:val="0"/>
-          <w:color w:val="595959"/>
-          <w:sz w:val="36"/>
-        </w:rPr>
-        <w:t xml:space="preserve">  |  </w:t>
-      </w:r>
-      <w:r>
-        <w:rPr>
-          <w:rFonts w:ascii="Calibri" w:hAnsi="Calibri"/>
-          <w:b w:val="0"/>
-          <w:i w:val="0"/>
-          <w:color w:val="595959"/>
-          <w:sz w:val="32"/>
-        </w:rPr>
-        <w:t>Corrective and Preventive Actions (proposed)</w:t>
+        <w:t>This shows how uncertain a run-1 result would be; under the decision in section D it is not reported.</w:t>
       </w:r>
     </w:p>
     <w:tbl>
@@ -2980,16 +2469,16 @@
       </w:tblPr>
       <w:tblGrid>
         <w:gridCol w:w="5216"/>
-        <w:gridCol w:w="1750"/>
-        <w:gridCol w:w="1750"/>
-        <w:gridCol w:w="1750"/>
+        <w:gridCol w:w="2608"/>
+        <w:gridCol w:w="2642"/>
       </w:tblGrid>
       <w:tr>
         <w:tc>
           <w:tcPr>
+            <w:gridSpan w:val="3"/>
             <w:shd w:val="clear" w:color="auto" w:fill="2B547E"/>
             <w:vAlign w:val="center"/>
-            <w:tcW w:type="dxa" w:w="5216"/>
+            <w:tcW w:type="dxa" w:w="10466"/>
           </w:tcPr>
           <w:p>
             <w:pPr>
@@ -3005,7 +2494,7 @@
                 <w:color w:val="FFFFFF"/>
                 <w:sz w:val="16"/>
               </w:rPr>
-              <w:t>Дејство</w:t>
+              <w:t>G2 на двете ваги, истите садови (Прилог 1)</w:t>
             </w:r>
             <w:r>
               <w:rPr>
@@ -3025,167 +2514,33 @@
                 <w:color w:val="FFFFFF"/>
                 <w:sz w:val="14"/>
               </w:rPr>
-              <w:t>Action</w:t>
-            </w:r>
-          </w:p>
-        </w:tc>
-        <w:tc>
-          <w:tcPr>
-            <w:shd w:val="clear" w:color="auto" w:fill="2B547E"/>
-            <w:vAlign w:val="center"/>
-            <w:tcW w:type="dxa" w:w="1750"/>
-          </w:tcPr>
-          <w:p>
-            <w:pPr>
-              <w:spacing w:before="20" w:after="20"/>
-              <w:jc w:val="center"/>
-            </w:pPr>
-            <w:r/>
-            <w:r>
-              <w:rPr>
-                <w:rFonts w:ascii="Calibri" w:hAnsi="Calibri"/>
-                <w:b/>
-                <w:i w:val="0"/>
-                <w:color w:val="FFFFFF"/>
-                <w:sz w:val="16"/>
-              </w:rPr>
-              <w:t>Одговорен</w:t>
-            </w:r>
-            <w:r>
-              <w:rPr>
-                <w:rFonts w:ascii="Calibri" w:hAnsi="Calibri"/>
-                <w:b w:val="0"/>
-                <w:i w:val="0"/>
-                <w:color w:val="FFFFFF"/>
-                <w:sz w:val="14"/>
-              </w:rPr>
-              <w:t xml:space="preserve"> | </w:t>
-            </w:r>
-            <w:r>
-              <w:rPr>
-                <w:rFonts w:ascii="Calibri" w:hAnsi="Calibri"/>
-                <w:b w:val="0"/>
-                <w:i w:val="0"/>
-                <w:color w:val="FFFFFF"/>
-                <w:sz w:val="14"/>
-              </w:rPr>
-              <w:t>Responsible</w:t>
-            </w:r>
-          </w:p>
-        </w:tc>
-        <w:tc>
-          <w:tcPr>
-            <w:shd w:val="clear" w:color="auto" w:fill="2B547E"/>
-            <w:vAlign w:val="center"/>
-            <w:tcW w:type="dxa" w:w="1750"/>
-          </w:tcPr>
-          <w:p>
-            <w:pPr>
-              <w:spacing w:before="20" w:after="20"/>
-              <w:jc w:val="center"/>
-            </w:pPr>
-            <w:r/>
-            <w:r>
-              <w:rPr>
-                <w:rFonts w:ascii="Calibri" w:hAnsi="Calibri"/>
-                <w:b/>
-                <w:i w:val="0"/>
-                <w:color w:val="FFFFFF"/>
-                <w:sz w:val="16"/>
-              </w:rPr>
-              <w:t>Рок</w:t>
-            </w:r>
-            <w:r>
-              <w:rPr>
-                <w:rFonts w:ascii="Calibri" w:hAnsi="Calibri"/>
-                <w:b w:val="0"/>
-                <w:i w:val="0"/>
-                <w:color w:val="FFFFFF"/>
-                <w:sz w:val="14"/>
-              </w:rPr>
-              <w:t xml:space="preserve"> | </w:t>
-            </w:r>
-            <w:r>
-              <w:rPr>
-                <w:rFonts w:ascii="Calibri" w:hAnsi="Calibri"/>
-                <w:b w:val="0"/>
-                <w:i w:val="0"/>
-                <w:color w:val="FFFFFF"/>
-                <w:sz w:val="14"/>
-              </w:rPr>
-              <w:t>Due</w:t>
-            </w:r>
-          </w:p>
-        </w:tc>
-        <w:tc>
-          <w:tcPr>
-            <w:shd w:val="clear" w:color="auto" w:fill="2B547E"/>
-            <w:vAlign w:val="center"/>
-            <w:tcW w:type="dxa" w:w="1750"/>
-          </w:tcPr>
-          <w:p>
-            <w:pPr>
-              <w:spacing w:before="20" w:after="20"/>
-              <w:jc w:val="center"/>
-            </w:pPr>
-            <w:r/>
-            <w:r>
-              <w:rPr>
-                <w:rFonts w:ascii="Calibri" w:hAnsi="Calibri"/>
-                <w:b/>
-                <w:i w:val="0"/>
-                <w:color w:val="FFFFFF"/>
-                <w:sz w:val="16"/>
-              </w:rPr>
-              <w:t>Иниц.</w:t>
-            </w:r>
-            <w:r>
-              <w:rPr>
-                <w:rFonts w:ascii="Calibri" w:hAnsi="Calibri"/>
-                <w:b w:val="0"/>
-                <w:i w:val="0"/>
-                <w:color w:val="FFFFFF"/>
-                <w:sz w:val="14"/>
-              </w:rPr>
-              <w:t xml:space="preserve"> | </w:t>
-            </w:r>
-            <w:r>
-              <w:rPr>
-                <w:rFonts w:ascii="Calibri" w:hAnsi="Calibri"/>
-                <w:b w:val="0"/>
-                <w:i w:val="0"/>
-                <w:color w:val="FFFFFF"/>
-                <w:sz w:val="14"/>
-              </w:rPr>
-              <w:t>Init.</w:t>
+              <w:t>G2 on both balances, same bottles (Attachment 1)</w:t>
             </w:r>
           </w:p>
         </w:tc>
       </w:tr>
       <w:tr>
-        <w:trPr>
-          <w:trHeight w:val="453" w:hRule="atLeast"/>
-        </w:trPr>
-        <w:tc>
-          <w:tcPr>
+        <w:tc>
+          <w:tcPr>
+            <w:shd w:val="clear" w:color="auto" w:fill="F2F2F2"/>
             <w:vAlign w:val="center"/>
             <w:tcW w:type="dxa" w:w="5216"/>
           </w:tcPr>
           <w:p>
             <w:pPr>
               <w:spacing w:before="20" w:after="20"/>
-              <w:jc w:val="left"/>
-            </w:pPr>
-            <w:r/>
-            <w:r>
-              <w:rPr>
-                <w:rFonts w:ascii="Calibri" w:hAnsi="Calibri"/>
-                <w:b w:val="0"/>
-                <w:i w:val="0"/>
-                <w:color w:val="000000"/>
-                <w:sz w:val="16"/>
-              </w:rPr>
-              <w:t>[ ] Работна картичка за a02.2 на работното место што ја именува AUW220D</w:t>
+              <w:jc w:val="center"/>
+            </w:pPr>
+            <w:r/>
+            <w:r>
+              <w:rPr>
+                <w:rFonts w:ascii="Calibri" w:hAnsi="Calibri"/>
+                <w:b/>
+                <w:i w:val="0"/>
+                <w:color w:val="000000"/>
+                <w:sz w:val="16"/>
+              </w:rPr>
+              <w:t>Садови</w:t>
             </w:r>
             <w:r>
               <w:rPr>
@@ -3201,58 +2556,104 @@
               <w:rPr>
                 <w:rFonts w:ascii="Calibri" w:hAnsi="Calibri"/>
                 <w:b w:val="0"/>
-                <w:i/>
+                <w:i w:val="0"/>
                 <w:color w:val="000000"/>
                 <w:sz w:val="14"/>
               </w:rPr>
-              <w:t>Bench card for a02.2 naming the AUW220D</w:t>
-            </w:r>
-          </w:p>
-        </w:tc>
-        <w:tc>
-          <w:tcPr>
-            <w:vAlign w:val="center"/>
-            <w:tcW w:type="dxa" w:w="1750"/>
-          </w:tcPr>
-          <w:p>
-            <w:pPr>
-              <w:spacing w:before="20" w:after="20"/>
-              <w:jc w:val="center"/>
-            </w:pPr>
-            <w:r/>
-          </w:p>
-        </w:tc>
-        <w:tc>
-          <w:tcPr>
-            <w:vAlign w:val="center"/>
-            <w:tcW w:type="dxa" w:w="1750"/>
-          </w:tcPr>
-          <w:p>
-            <w:pPr>
-              <w:spacing w:before="20" w:after="20"/>
-              <w:jc w:val="center"/>
-            </w:pPr>
-            <w:r/>
-          </w:p>
-        </w:tc>
-        <w:tc>
-          <w:tcPr>
-            <w:vAlign w:val="center"/>
-            <w:tcW w:type="dxa" w:w="1750"/>
-          </w:tcPr>
-          <w:p>
-            <w:pPr>
-              <w:spacing w:before="20" w:after="20"/>
-              <w:jc w:val="center"/>
-            </w:pPr>
-            <w:r/>
+              <w:t>Bottles (n)</w:t>
+            </w:r>
+          </w:p>
+        </w:tc>
+        <w:tc>
+          <w:tcPr>
+            <w:shd w:val="clear" w:color="auto" w:fill="F2F2F2"/>
+            <w:vAlign w:val="center"/>
+            <w:tcW w:type="dxa" w:w="2608"/>
+          </w:tcPr>
+          <w:p>
+            <w:pPr>
+              <w:spacing w:before="20" w:after="20"/>
+              <w:jc w:val="center"/>
+            </w:pPr>
+            <w:r/>
+            <w:r>
+              <w:rPr>
+                <w:rFonts w:ascii="Calibri" w:hAnsi="Calibri"/>
+                <w:b/>
+                <w:i w:val="0"/>
+                <w:color w:val="000000"/>
+                <w:sz w:val="16"/>
+              </w:rPr>
+              <w:t>Средна разлика G2_AUW − G2_прец., mg</w:t>
+            </w:r>
+            <w:r>
+              <w:rPr>
+                <w:rFonts w:ascii="Calibri" w:hAnsi="Calibri"/>
+                <w:b w:val="0"/>
+                <w:i w:val="0"/>
+                <w:color w:val="000000"/>
+                <w:sz w:val="14"/>
+              </w:rPr>
+              <w:t xml:space="preserve"> | </w:t>
+            </w:r>
+            <w:r>
+              <w:rPr>
+                <w:rFonts w:ascii="Calibri" w:hAnsi="Calibri"/>
+                <w:b w:val="0"/>
+                <w:i w:val="0"/>
+                <w:color w:val="000000"/>
+                <w:sz w:val="14"/>
+              </w:rPr>
+              <w:t>Mean G2_AUW − G2_prec, mg</w:t>
+            </w:r>
+          </w:p>
+        </w:tc>
+        <w:tc>
+          <w:tcPr>
+            <w:shd w:val="clear" w:color="auto" w:fill="F2F2F2"/>
+            <w:vAlign w:val="center"/>
+            <w:tcW w:type="dxa" w:w="2642"/>
+          </w:tcPr>
+          <w:p>
+            <w:pPr>
+              <w:spacing w:before="20" w:after="20"/>
+              <w:jc w:val="center"/>
+            </w:pPr>
+            <w:r/>
+            <w:r>
+              <w:rPr>
+                <w:rFonts w:ascii="Calibri" w:hAnsi="Calibri"/>
+                <w:b/>
+                <w:i w:val="0"/>
+                <w:color w:val="000000"/>
+                <w:sz w:val="16"/>
+              </w:rPr>
+              <w:t>SD на разликата, mg</w:t>
+            </w:r>
+            <w:r>
+              <w:rPr>
+                <w:rFonts w:ascii="Calibri" w:hAnsi="Calibri"/>
+                <w:b w:val="0"/>
+                <w:i w:val="0"/>
+                <w:color w:val="000000"/>
+                <w:sz w:val="14"/>
+              </w:rPr>
+              <w:t xml:space="preserve"> | </w:t>
+            </w:r>
+            <w:r>
+              <w:rPr>
+                <w:rFonts w:ascii="Calibri" w:hAnsi="Calibri"/>
+                <w:b w:val="0"/>
+                <w:i w:val="0"/>
+                <w:color w:val="000000"/>
+                <w:sz w:val="14"/>
+              </w:rPr>
+              <w:t>SD of the difference, mg</w:t>
+            </w:r>
           </w:p>
         </w:tc>
       </w:tr>
       <w:tr>
-        <w:trPr>
-          <w:trHeight w:val="453" w:hRule="atLeast"/>
-        </w:trPr>
         <w:tc>
           <w:tcPr>
             <w:vAlign w:val="center"/>
@@ -3261,256 +2662,105 @@
           <w:p>
             <w:pPr>
               <w:spacing w:before="20" w:after="20"/>
-              <w:jc w:val="left"/>
-            </w:pPr>
-            <w:r/>
-            <w:r>
-              <w:rPr>
-                <w:rFonts w:ascii="Calibri" w:hAnsi="Calibri"/>
-                <w:b w:val="0"/>
-                <w:i w:val="0"/>
-                <w:color w:val="000000"/>
-                <w:sz w:val="16"/>
-              </w:rPr>
-              <w:t>[ ] Ознака на прецизната вага: не за аналитичко мерење</w:t>
-            </w:r>
-            <w:r>
-              <w:rPr>
-                <w:rFonts w:ascii="Calibri" w:hAnsi="Calibri"/>
-                <w:b w:val="0"/>
-                <w:i w:val="0"/>
-                <w:color w:val="000000"/>
-                <w:sz w:val="14"/>
-              </w:rPr>
-              <w:t xml:space="preserve"> | </w:t>
-            </w:r>
-            <w:r>
-              <w:rPr>
-                <w:rFonts w:ascii="Calibri" w:hAnsi="Calibri"/>
-                <w:b w:val="0"/>
-                <w:i/>
-                <w:color w:val="000000"/>
-                <w:sz w:val="14"/>
-              </w:rPr>
-              <w:t>Label on the precision balance: not for analytical weighing</w:t>
-            </w:r>
-          </w:p>
-        </w:tc>
-        <w:tc>
-          <w:tcPr>
-            <w:vAlign w:val="center"/>
-            <w:tcW w:type="dxa" w:w="1750"/>
-          </w:tcPr>
-          <w:p>
-            <w:pPr>
-              <w:spacing w:before="20" w:after="20"/>
-              <w:jc w:val="center"/>
-            </w:pPr>
-            <w:r/>
-          </w:p>
-        </w:tc>
-        <w:tc>
-          <w:tcPr>
-            <w:vAlign w:val="center"/>
-            <w:tcW w:type="dxa" w:w="1750"/>
-          </w:tcPr>
-          <w:p>
-            <w:pPr>
-              <w:spacing w:before="20" w:after="20"/>
-              <w:jc w:val="center"/>
-            </w:pPr>
-            <w:r/>
-          </w:p>
-        </w:tc>
-        <w:tc>
-          <w:tcPr>
-            <w:vAlign w:val="center"/>
-            <w:tcW w:type="dxa" w:w="1750"/>
-          </w:tcPr>
-          <w:p>
-            <w:pPr>
-              <w:spacing w:before="20" w:after="20"/>
-              <w:jc w:val="center"/>
-            </w:pPr>
-            <w:r/>
-          </w:p>
-        </w:tc>
-      </w:tr>
-      <w:tr>
-        <w:trPr>
-          <w:trHeight w:val="453" w:hRule="atLeast"/>
-        </w:trPr>
-        <w:tc>
-          <w:tcPr>
-            <w:vAlign w:val="center"/>
-            <w:tcW w:type="dxa" w:w="5216"/>
-          </w:tcPr>
-          <w:p>
-            <w:pPr>
-              <w:spacing w:before="20" w:after="20"/>
-              <w:jc w:val="left"/>
-            </w:pPr>
-            <w:r/>
-            <w:r>
-              <w:rPr>
-                <w:rFonts w:ascii="Calibri" w:hAnsi="Calibri"/>
-                <w:b w:val="0"/>
-                <w:i w:val="0"/>
-                <w:color w:val="000000"/>
-                <w:sz w:val="16"/>
-              </w:rPr>
-              <w:t>[ ] Обука за a02.2 и QCWI 016</w:t>
-            </w:r>
-            <w:r>
-              <w:rPr>
-                <w:rFonts w:ascii="Calibri" w:hAnsi="Calibri"/>
-                <w:b w:val="0"/>
-                <w:i w:val="0"/>
-                <w:color w:val="000000"/>
-                <w:sz w:val="14"/>
-              </w:rPr>
-              <w:t xml:space="preserve"> | </w:t>
-            </w:r>
-            <w:r>
-              <w:rPr>
-                <w:rFonts w:ascii="Calibri" w:hAnsi="Calibri"/>
-                <w:b w:val="0"/>
-                <w:i/>
-                <w:color w:val="000000"/>
-                <w:sz w:val="14"/>
-              </w:rPr>
-              <w:t>Training on a02.2 and QCWI 016</w:t>
-            </w:r>
-          </w:p>
-        </w:tc>
-        <w:tc>
-          <w:tcPr>
-            <w:vAlign w:val="center"/>
-            <w:tcW w:type="dxa" w:w="1750"/>
-          </w:tcPr>
-          <w:p>
-            <w:pPr>
-              <w:spacing w:before="20" w:after="20"/>
-              <w:jc w:val="center"/>
-            </w:pPr>
-            <w:r/>
-          </w:p>
-        </w:tc>
-        <w:tc>
-          <w:tcPr>
-            <w:vAlign w:val="center"/>
-            <w:tcW w:type="dxa" w:w="1750"/>
-          </w:tcPr>
-          <w:p>
-            <w:pPr>
-              <w:spacing w:before="20" w:after="20"/>
-              <w:jc w:val="center"/>
-            </w:pPr>
-            <w:r/>
-          </w:p>
-        </w:tc>
-        <w:tc>
-          <w:tcPr>
-            <w:vAlign w:val="center"/>
-            <w:tcW w:type="dxa" w:w="1750"/>
-          </w:tcPr>
-          <w:p>
-            <w:pPr>
-              <w:spacing w:before="20" w:after="20"/>
-              <w:jc w:val="center"/>
-            </w:pPr>
-            <w:r/>
-          </w:p>
-        </w:tc>
-      </w:tr>
-      <w:tr>
-        <w:trPr>
-          <w:trHeight w:val="453" w:hRule="atLeast"/>
-        </w:trPr>
-        <w:tc>
-          <w:tcPr>
-            <w:vAlign w:val="center"/>
-            <w:tcW w:type="dxa" w:w="5216"/>
-          </w:tcPr>
-          <w:p>
-            <w:pPr>
-              <w:spacing w:before="20" w:after="20"/>
-              <w:jc w:val="left"/>
-            </w:pPr>
-            <w:r/>
-            <w:r>
-              <w:rPr>
-                <w:rFonts w:ascii="Calibri" w:hAnsi="Calibri"/>
-                <w:b w:val="0"/>
-                <w:i w:val="0"/>
-                <w:color w:val="000000"/>
-                <w:sz w:val="16"/>
-              </w:rPr>
-              <w:t>[ ] Друго</w:t>
-            </w:r>
-            <w:r>
-              <w:rPr>
-                <w:rFonts w:ascii="Calibri" w:hAnsi="Calibri"/>
-                <w:b w:val="0"/>
-                <w:i w:val="0"/>
-                <w:color w:val="000000"/>
-                <w:sz w:val="14"/>
-              </w:rPr>
-              <w:t xml:space="preserve"> | </w:t>
-            </w:r>
-            <w:r>
-              <w:rPr>
-                <w:rFonts w:ascii="Calibri" w:hAnsi="Calibri"/>
-                <w:b w:val="0"/>
-                <w:i/>
-                <w:color w:val="000000"/>
-                <w:sz w:val="14"/>
-              </w:rPr>
-              <w:t>Other: ____________</w:t>
-            </w:r>
-          </w:p>
-        </w:tc>
-        <w:tc>
-          <w:tcPr>
-            <w:vAlign w:val="center"/>
-            <w:tcW w:type="dxa" w:w="1750"/>
-          </w:tcPr>
-          <w:p>
-            <w:pPr>
-              <w:spacing w:before="20" w:after="20"/>
-              <w:jc w:val="center"/>
-            </w:pPr>
-            <w:r/>
-          </w:p>
-        </w:tc>
-        <w:tc>
-          <w:tcPr>
-            <w:vAlign w:val="center"/>
-            <w:tcW w:type="dxa" w:w="1750"/>
-          </w:tcPr>
-          <w:p>
-            <w:pPr>
-              <w:spacing w:before="20" w:after="20"/>
-              <w:jc w:val="center"/>
-            </w:pPr>
-            <w:r/>
-          </w:p>
-        </w:tc>
-        <w:tc>
-          <w:tcPr>
-            <w:vAlign w:val="center"/>
-            <w:tcW w:type="dxa" w:w="1750"/>
-          </w:tcPr>
-          <w:p>
-            <w:pPr>
-              <w:spacing w:before="20" w:after="20"/>
-              <w:jc w:val="center"/>
-            </w:pPr>
-            <w:r/>
+              <w:jc w:val="center"/>
+            </w:pPr>
+            <w:r/>
+            <w:r>
+              <w:rPr>
+                <w:rFonts w:ascii="Calibri" w:hAnsi="Calibri"/>
+                <w:b w:val="0"/>
+                <w:i w:val="0"/>
+                <w:color w:val="000000"/>
+                <w:sz w:val="16"/>
+              </w:rPr>
+              <w:t>46</w:t>
+            </w:r>
+          </w:p>
+        </w:tc>
+        <w:tc>
+          <w:tcPr>
+            <w:vAlign w:val="center"/>
+            <w:tcW w:type="dxa" w:w="2608"/>
+          </w:tcPr>
+          <w:p>
+            <w:pPr>
+              <w:spacing w:before="20" w:after="20"/>
+              <w:jc w:val="center"/>
+            </w:pPr>
+            <w:r/>
+            <w:r>
+              <w:rPr>
+                <w:rFonts w:ascii="Calibri" w:hAnsi="Calibri"/>
+                <w:b w:val="0"/>
+                <w:i w:val="0"/>
+                <w:color w:val="000000"/>
+                <w:sz w:val="16"/>
+              </w:rPr>
+              <w:t>____________</w:t>
+            </w:r>
+          </w:p>
+        </w:tc>
+        <w:tc>
+          <w:tcPr>
+            <w:vAlign w:val="center"/>
+            <w:tcW w:type="dxa" w:w="2642"/>
+          </w:tcPr>
+          <w:p>
+            <w:pPr>
+              <w:spacing w:before="20" w:after="20"/>
+              <w:jc w:val="center"/>
+            </w:pPr>
+            <w:r/>
+            <w:r>
+              <w:rPr>
+                <w:rFonts w:ascii="Calibri" w:hAnsi="Calibri"/>
+                <w:b w:val="0"/>
+                <w:i w:val="0"/>
+                <w:color w:val="000000"/>
+                <w:sz w:val="16"/>
+              </w:rPr>
+              <w:t>____________</w:t>
+            </w:r>
           </w:p>
         </w:tc>
       </w:tr>
     </w:tbl>
+    <w:p>
+      <w:pPr>
+        <w:spacing w:before="90" w:after="90"/>
+        <w:jc w:val="both"/>
+      </w:pPr>
+      <w:r>
+        <w:rPr>
+          <w:rFonts w:ascii="Calibri" w:hAnsi="Calibri"/>
+          <w:b w:val="0"/>
+          <w:i/>
+          <w:color w:val="595959"/>
+          <w:sz w:val="20"/>
+        </w:rPr>
+        <w:t>Помошни податоци за отстапувањето и повторливоста на прецизната вага; не се користат за ниеден резултат.</w:t>
+      </w:r>
+      <w:r>
+        <w:rPr>
+          <w:rFonts w:ascii="Calibri" w:hAnsi="Calibri"/>
+          <w:b w:val="0"/>
+          <w:i w:val="0"/>
+          <w:color w:val="595959"/>
+          <w:sz w:val="16"/>
+        </w:rPr>
+        <w:t xml:space="preserve">  |  </w:t>
+      </w:r>
+      <w:r>
+        <w:rPr>
+          <w:rFonts w:ascii="Calibri" w:hAnsi="Calibri"/>
+          <w:b w:val="0"/>
+          <w:i/>
+          <w:color w:val="595959"/>
+          <w:sz w:val="16"/>
+        </w:rPr>
+        <w:t>Supporting data on the precision balance's offset and repeatability; not used for any result.</w:t>
+      </w:r>
+    </w:p>
     <w:p>
       <w:pPr>
         <w:keepNext/>
@@ -3525,7 +2775,7 @@
           <w:color w:val="2B547E"/>
           <w:sz w:val="40"/>
         </w:rPr>
-        <w:t>G.  КЛАСИФИКАЦИЈА И ЗАТВОРАЊЕ</w:t>
+        <w:t>D.  ОДЛУКА НА РАКОВОДИТЕЛОТ НА КК (06.10.2026)</w:t>
       </w:r>
       <w:r>
         <w:rPr>
@@ -3545,7 +2795,43 @@
           <w:color w:val="595959"/>
           <w:sz w:val="32"/>
         </w:rPr>
-        <w:t>Classification and Closure</w:t>
+        <w:t>Decision of the Head of QC (06.10.2026)</w:t>
+      </w:r>
+    </w:p>
+    <w:p>
+      <w:pPr>
+        <w:spacing w:before="0" w:after="0" w:line="250" w:lineRule="auto"/>
+        <w:jc w:val="both"/>
+      </w:pPr>
+      <w:r>
+        <w:rPr>
+          <w:rFonts w:ascii="Calibri" w:hAnsi="Calibri"/>
+          <w:b w:val="0"/>
+          <w:i w:val="0"/>
+          <w:color w:val="000000"/>
+          <w:sz w:val="22"/>
+        </w:rPr>
+        <w:t>Методот (a02.2, Ph. Eur. 2.2.32 / 3028) бара вага што чита најмалку 4 децимали (0,1 mg). m_B и G1 од сушењето 1 се измерени само на 1 mg и ниедно подоцнежно мерење не може тоа да го поправи: G2 на AUW220D, спарено со G1 од прецизната вага, дава ист број како парот од прецизната вага. Затоа сушењето 1 (PP-QC-SP-002/26-LOD-01) се поништува поради утврдена лабораториска причина, и сите 46 серии се повторуваат по a02.2 на AUW220D од остатоците од примероците (PP-QC-SP-002/26-LOD-01R): нова порција од 1,000 g, m_B, G1 и G2 на AUW220D, едно сушење. За секоја серија се известува повторениот резултат, без оглед на вредностите од сушењето 1; тие остануваат во записот и не се известуваат.</w:t>
+      </w:r>
+      <w:r>
+        <w:rPr>
+          <w:rFonts w:ascii="Calibri" w:hAnsi="Calibri"/>
+          <w:b w:val="0"/>
+          <w:i w:val="0"/>
+          <w:color w:val="595959"/>
+          <w:sz w:val="16"/>
+        </w:rPr>
+        <w:t xml:space="preserve">  |  </w:t>
+      </w:r>
+      <w:r>
+        <w:rPr>
+          <w:rFonts w:ascii="Calibri" w:hAnsi="Calibri"/>
+          <w:b w:val="0"/>
+          <w:i/>
+          <w:color w:val="595959"/>
+          <w:sz w:val="16"/>
+        </w:rPr>
+        <w:t>The method (a02.2, Ph. Eur. 2.2.32 / 3028) requires a balance reading at least 4 decimals (0.1 mg). m_B and G1 of run 1 were weighed to 1 mg only, and no later weighing can correct that: G2 on the AUW220D, paired with G1 from the precision balance, gives the same number as the precision pair. Run 1 (PP-QC-SP-002/26-LOD-01) is therefore invalidated for an assignable laboratory cause, and all 46 batches are repeated per a02.2 on the AUW220D from the sample remainders (PP-QC-SP-002/26-LOD-01R): a new 1.000 g portion, m_B, G1 and G2 on the AUW220D, one oven run. For every batch the repeat result is reported, whatever the run-1 values; those stay in the record and are not reported.</w:t>
       </w:r>
     </w:p>
     <w:tbl>
@@ -3592,7 +2878,7 @@
                 <w:color w:val="000000"/>
                 <w:sz w:val="18"/>
               </w:rPr>
-              <w:t>Класификација (QA)</w:t>
+              <w:t>Резултатите од сушењето 1 пресметани пред одлуката</w:t>
             </w:r>
             <w:r>
               <w:rPr>
@@ -3612,7 +2898,7 @@
                 <w:color w:val="000000"/>
                 <w:sz w:val="14"/>
               </w:rPr>
-              <w:t>Classification (QA)</w:t>
+              <w:t>Run-1 results calculated before the decision</w:t>
             </w:r>
           </w:p>
         </w:tc>
@@ -3635,7 +2921,7 @@
                 <w:color w:val="000000"/>
                 <w:sz w:val="18"/>
               </w:rPr>
-              <w:t>[ ] мало</w:t>
+              <w:t>[ ] не</w:t>
             </w:r>
             <w:r>
               <w:rPr>
@@ -3655,7 +2941,153 @@
                 <w:color w:val="000000"/>
                 <w:sz w:val="14"/>
               </w:rPr>
-              <w:t>minor   [ ] големо | major   [ ] критично | critical</w:t>
+              <w:t>no   [ ] да | yes</w:t>
+            </w:r>
+          </w:p>
+        </w:tc>
+      </w:tr>
+    </w:tbl>
+    <w:p>
+      <w:pPr>
+        <w:spacing w:before="40" w:after="80"/>
+      </w:pPr>
+      <w:r>
+        <w:rPr>
+          <w:rFonts w:ascii="Calibri" w:hAnsi="Calibri"/>
+          <w:b/>
+          <w:i w:val="0"/>
+          <w:color w:val="2B547E"/>
+          <w:sz w:val="20"/>
+        </w:rPr>
+        <w:t>Претходно правило — заменето со одлуката погоре</w:t>
+      </w:r>
+      <w:r>
+        <w:rPr>
+          <w:rFonts w:ascii="Calibri" w:hAnsi="Calibri"/>
+          <w:b w:val="0"/>
+          <w:i w:val="0"/>
+          <w:color w:val="595959"/>
+          <w:sz w:val="18"/>
+        </w:rPr>
+        <w:t xml:space="preserve">  |  </w:t>
+      </w:r>
+      <w:r>
+        <w:rPr>
+          <w:rFonts w:ascii="Calibri" w:hAnsi="Calibri"/>
+          <w:b w:val="0"/>
+          <w:i/>
+          <w:color w:val="595959"/>
+          <w:sz w:val="18"/>
+        </w:rPr>
+        <w:t>Earlier rule — superseded by the decision above</w:t>
+      </w:r>
+    </w:p>
+    <w:tbl>
+      <w:tblPr>
+        <w:tblLook w:firstColumn="1" w:firstRow="1" w:lastColumn="0" w:lastRow="0" w:noHBand="0" w:noVBand="1" w:val="04A0"/>
+        <w:tblLayout w:type="fixed"/>
+        <w:tblW w:type="dxa" w:w="10466"/>
+        <w:tblInd w:type="dxa" w:w="0"/>
+        <w:jc w:val="center"/>
+        <w:tblBorders>
+          <w:top w:val="single" w:sz="4" w:space="0" w:color="2B547E"/>
+          <w:left w:val="single" w:sz="4" w:space="0" w:color="2B547E"/>
+          <w:bottom w:val="single" w:sz="4" w:space="0" w:color="2B547E"/>
+          <w:right w:val="single" w:sz="4" w:space="0" w:color="2B547E"/>
+          <w:insideH w:val="single" w:sz="4" w:space="0" w:color="2B547E"/>
+          <w:insideV w:val="single" w:sz="4" w:space="0" w:color="2B547E"/>
+        </w:tblBorders>
+      </w:tblPr>
+      <w:tblGrid>
+        <w:gridCol w:w="2381"/>
+        <w:gridCol w:w="8085"/>
+      </w:tblGrid>
+      <w:tr>
+        <w:tc>
+          <w:tcPr>
+            <w:shd w:val="clear" w:color="auto" w:fill="2B547E"/>
+            <w:vAlign w:val="center"/>
+            <w:tcW w:type="dxa" w:w="2381"/>
+          </w:tcPr>
+          <w:p>
+            <w:pPr>
+              <w:spacing w:before="20" w:after="20"/>
+              <w:jc w:val="center"/>
+            </w:pPr>
+            <w:r/>
+            <w:r>
+              <w:rPr>
+                <w:rFonts w:ascii="Calibri" w:hAnsi="Calibri"/>
+                <w:b/>
+                <w:i w:val="0"/>
+                <w:color w:val="FFFFFF"/>
+                <w:sz w:val="16"/>
+              </w:rPr>
+              <w:t>ГпС % (прецизна вага)</w:t>
+            </w:r>
+            <w:r>
+              <w:rPr>
+                <w:rFonts w:ascii="Calibri" w:hAnsi="Calibri"/>
+                <w:b w:val="0"/>
+                <w:i w:val="0"/>
+                <w:color w:val="FFFFFF"/>
+                <w:sz w:val="14"/>
+              </w:rPr>
+              <w:t xml:space="preserve"> | </w:t>
+            </w:r>
+            <w:r>
+              <w:rPr>
+                <w:rFonts w:ascii="Calibri" w:hAnsi="Calibri"/>
+                <w:b w:val="0"/>
+                <w:i w:val="0"/>
+                <w:color w:val="FFFFFF"/>
+                <w:sz w:val="14"/>
+              </w:rPr>
+              <w:t>LoD % (precision balance)</w:t>
+            </w:r>
+          </w:p>
+        </w:tc>
+        <w:tc>
+          <w:tcPr>
+            <w:shd w:val="clear" w:color="auto" w:fill="2B547E"/>
+            <w:vAlign w:val="center"/>
+            <w:tcW w:type="dxa" w:w="8085"/>
+          </w:tcPr>
+          <w:p>
+            <w:pPr>
+              <w:spacing w:before="20" w:after="20"/>
+              <w:jc w:val="center"/>
+            </w:pPr>
+            <w:r/>
+            <w:r>
+              <w:rPr>
+                <w:rFonts w:ascii="Calibri" w:hAnsi="Calibri"/>
+                <w:b/>
+                <w:i w:val="0"/>
+                <w:color w:val="FFFFFF"/>
+                <w:sz w:val="16"/>
+              </w:rPr>
+              <w:t>Одлука</w:t>
+            </w:r>
+            <w:r>
+              <w:rPr>
+                <w:rFonts w:ascii="Calibri" w:hAnsi="Calibri"/>
+                <w:b w:val="0"/>
+                <w:i w:val="0"/>
+                <w:color w:val="FFFFFF"/>
+                <w:sz w:val="14"/>
+              </w:rPr>
+              <w:t xml:space="preserve"> | </w:t>
+            </w:r>
+            <w:r>
+              <w:rPr>
+                <w:rFonts w:ascii="Calibri" w:hAnsi="Calibri"/>
+                <w:b w:val="0"/>
+                <w:i w:val="0"/>
+                <w:color w:val="FFFFFF"/>
+                <w:sz w:val="14"/>
+              </w:rPr>
+              <w:t>Decision</w:t>
             </w:r>
           </w:p>
         </w:tc>
@@ -3663,6 +3095,1068 @@
       <w:tr>
         <w:tc>
           <w:tcPr>
+            <w:vAlign w:val="center"/>
+            <w:tcW w:type="dxa" w:w="2381"/>
+          </w:tcPr>
+          <w:p>
+            <w:pPr>
+              <w:spacing w:before="20" w:after="20"/>
+              <w:jc w:val="center"/>
+            </w:pPr>
+            <w:r/>
+            <w:r>
+              <w:rPr>
+                <w:rFonts w:ascii="Calibri" w:hAnsi="Calibri"/>
+                <w:b/>
+                <w:i w:val="0"/>
+                <w:color w:val="000000"/>
+                <w:sz w:val="16"/>
+              </w:rPr>
+              <w:t>≤ 11,7</w:t>
+            </w:r>
+          </w:p>
+        </w:tc>
+        <w:tc>
+          <w:tcPr>
+            <w:vAlign w:val="center"/>
+            <w:tcW w:type="dxa" w:w="8085"/>
+          </w:tcPr>
+          <w:p>
+            <w:pPr>
+              <w:spacing w:before="20" w:after="20"/>
+              <w:jc w:val="left"/>
+            </w:pPr>
+            <w:r/>
+            <w:r>
+              <w:rPr>
+                <w:rFonts w:ascii="Calibri" w:hAnsi="Calibri"/>
+                <w:b w:val="0"/>
+                <w:i w:val="0"/>
+                <w:color w:val="000000"/>
+                <w:sz w:val="16"/>
+              </w:rPr>
+              <w:t>Одговара (≤ 12,0 % и со U = 0,3 %).</w:t>
+            </w:r>
+            <w:r>
+              <w:rPr>
+                <w:rFonts w:ascii="Calibri" w:hAnsi="Calibri"/>
+                <w:b w:val="0"/>
+                <w:i w:val="0"/>
+                <w:color w:val="000000"/>
+                <w:sz w:val="14"/>
+              </w:rPr>
+              <w:t xml:space="preserve"> | </w:t>
+            </w:r>
+            <w:r>
+              <w:rPr>
+                <w:rFonts w:ascii="Calibri" w:hAnsi="Calibri"/>
+                <w:b w:val="0"/>
+                <w:i/>
+                <w:color w:val="000000"/>
+                <w:sz w:val="14"/>
+              </w:rPr>
+              <w:t>Conforms (≤ 12.0 % even with U = 0.3 %).</w:t>
+            </w:r>
+          </w:p>
+        </w:tc>
+      </w:tr>
+      <w:tr>
+        <w:tc>
+          <w:tcPr>
+            <w:vAlign w:val="center"/>
+            <w:tcW w:type="dxa" w:w="2381"/>
+          </w:tcPr>
+          <w:p>
+            <w:pPr>
+              <w:spacing w:before="20" w:after="20"/>
+              <w:jc w:val="center"/>
+            </w:pPr>
+            <w:r/>
+            <w:r>
+              <w:rPr>
+                <w:rFonts w:ascii="Calibri" w:hAnsi="Calibri"/>
+                <w:b/>
+                <w:i w:val="0"/>
+                <w:color w:val="000000"/>
+                <w:sz w:val="16"/>
+              </w:rPr>
+              <w:t>11,8 – 12,3</w:t>
+            </w:r>
+          </w:p>
+        </w:tc>
+        <w:tc>
+          <w:tcPr>
+            <w:vAlign w:val="center"/>
+            <w:tcW w:type="dxa" w:w="8085"/>
+          </w:tcPr>
+          <w:p>
+            <w:pPr>
+              <w:spacing w:before="20" w:after="20"/>
+              <w:jc w:val="left"/>
+            </w:pPr>
+            <w:r/>
+            <w:r>
+              <w:rPr>
+                <w:rFonts w:ascii="Calibri" w:hAnsi="Calibri"/>
+                <w:b w:val="0"/>
+                <w:i w:val="0"/>
+                <w:color w:val="000000"/>
+                <w:sz w:val="16"/>
+              </w:rPr>
+              <w:t>Без одлука: повторување во целост по a02.2 на AUW220D од остатокот на примерокот (m_B, G1 и G2 на AUW220D); се известува повторениот резултат, двата остануваат во записот.</w:t>
+            </w:r>
+            <w:r>
+              <w:rPr>
+                <w:rFonts w:ascii="Calibri" w:hAnsi="Calibri"/>
+                <w:b w:val="0"/>
+                <w:i w:val="0"/>
+                <w:color w:val="000000"/>
+                <w:sz w:val="14"/>
+              </w:rPr>
+              <w:t xml:space="preserve"> | </w:t>
+            </w:r>
+            <w:r>
+              <w:rPr>
+                <w:rFonts w:ascii="Calibri" w:hAnsi="Calibri"/>
+                <w:b w:val="0"/>
+                <w:i/>
+                <w:color w:val="000000"/>
+                <w:sz w:val="14"/>
+              </w:rPr>
+              <w:t>No decision: full repeat per a02.2 on the AUW220D from the sample remainder (m_B, G1 and G2 on the AUW220D); the repeat is reported, both stay in the record.</w:t>
+            </w:r>
+          </w:p>
+        </w:tc>
+      </w:tr>
+      <w:tr>
+        <w:tc>
+          <w:tcPr>
+            <w:vAlign w:val="center"/>
+            <w:tcW w:type="dxa" w:w="2381"/>
+          </w:tcPr>
+          <w:p>
+            <w:pPr>
+              <w:spacing w:before="20" w:after="20"/>
+              <w:jc w:val="center"/>
+            </w:pPr>
+            <w:r/>
+            <w:r>
+              <w:rPr>
+                <w:rFonts w:ascii="Calibri" w:hAnsi="Calibri"/>
+                <w:b/>
+                <w:i w:val="0"/>
+                <w:color w:val="000000"/>
+                <w:sz w:val="16"/>
+              </w:rPr>
+              <w:t>&gt; 12,3</w:t>
+            </w:r>
+          </w:p>
+        </w:tc>
+        <w:tc>
+          <w:tcPr>
+            <w:vAlign w:val="center"/>
+            <w:tcW w:type="dxa" w:w="8085"/>
+          </w:tcPr>
+          <w:p>
+            <w:pPr>
+              <w:spacing w:before="20" w:after="20"/>
+              <w:jc w:val="left"/>
+            </w:pPr>
+            <w:r/>
+            <w:r>
+              <w:rPr>
+                <w:rFonts w:ascii="Calibri" w:hAnsi="Calibri"/>
+                <w:b w:val="0"/>
+                <w:i w:val="0"/>
+                <w:color w:val="000000"/>
+                <w:sz w:val="16"/>
+              </w:rPr>
+              <w:t>OOS по QCSOP 014: грешката на вагата не може да ја објасни разликата.</w:t>
+            </w:r>
+            <w:r>
+              <w:rPr>
+                <w:rFonts w:ascii="Calibri" w:hAnsi="Calibri"/>
+                <w:b w:val="0"/>
+                <w:i w:val="0"/>
+                <w:color w:val="000000"/>
+                <w:sz w:val="14"/>
+              </w:rPr>
+              <w:t xml:space="preserve"> | </w:t>
+            </w:r>
+            <w:r>
+              <w:rPr>
+                <w:rFonts w:ascii="Calibri" w:hAnsi="Calibri"/>
+                <w:b w:val="0"/>
+                <w:i/>
+                <w:color w:val="000000"/>
+                <w:sz w:val="14"/>
+              </w:rPr>
+              <w:t>OOS per QCSOP 014: the balance error cannot explain the difference.</w:t>
+            </w:r>
+          </w:p>
+        </w:tc>
+      </w:tr>
+    </w:tbl>
+    <w:p>
+      <w:pPr>
+        <w:spacing w:before="90" w:after="90"/>
+        <w:jc w:val="both"/>
+      </w:pPr>
+      <w:r>
+        <w:rPr>
+          <w:rFonts w:ascii="Calibri" w:hAnsi="Calibri"/>
+          <w:b w:val="0"/>
+          <w:i/>
+          <w:color w:val="595959"/>
+          <w:sz w:val="20"/>
+        </w:rPr>
+        <w:t>Заменето со одлуката во делот D; истото важи за опсезите отпечатени на Прилог 1.</w:t>
+      </w:r>
+      <w:r>
+        <w:rPr>
+          <w:rFonts w:ascii="Calibri" w:hAnsi="Calibri"/>
+          <w:b w:val="0"/>
+          <w:i w:val="0"/>
+          <w:color w:val="595959"/>
+          <w:sz w:val="16"/>
+        </w:rPr>
+        <w:t xml:space="preserve">  |  </w:t>
+      </w:r>
+      <w:r>
+        <w:rPr>
+          <w:rFonts w:ascii="Calibri" w:hAnsi="Calibri"/>
+          <w:b w:val="0"/>
+          <w:i/>
+          <w:color w:val="595959"/>
+          <w:sz w:val="16"/>
+        </w:rPr>
+        <w:t>Superseded by the decision in section D; so are the bands printed on Attachment 1.</w:t>
+      </w:r>
+    </w:p>
+    <w:p>
+      <w:pPr>
+        <w:keepNext/>
+        <w:spacing w:before="240" w:after="140"/>
+        <w:outlineLvl w:val="0"/>
+      </w:pPr>
+      <w:r>
+        <w:rPr>
+          <w:rFonts w:ascii="Calibri" w:hAnsi="Calibri"/>
+          <w:b/>
+          <w:i w:val="0"/>
+          <w:color w:val="2B547E"/>
+          <w:sz w:val="40"/>
+        </w:rPr>
+        <w:t>E.  ПРИЧИНА</w:t>
+      </w:r>
+      <w:r>
+        <w:rPr>
+          <w:rFonts w:ascii="Calibri" w:hAnsi="Calibri"/>
+          <w:b w:val="0"/>
+          <w:i w:val="0"/>
+          <w:color w:val="595959"/>
+          <w:sz w:val="36"/>
+        </w:rPr>
+        <w:t xml:space="preserve">  |  </w:t>
+      </w:r>
+      <w:r>
+        <w:rPr>
+          <w:rFonts w:ascii="Calibri" w:hAnsi="Calibri"/>
+          <w:b w:val="0"/>
+          <w:i w:val="0"/>
+          <w:color w:val="595959"/>
+          <w:sz w:val="32"/>
+        </w:rPr>
+        <w:t>Root Cause</w:t>
+      </w:r>
+    </w:p>
+    <w:tbl>
+      <w:tblPr>
+        <w:tblLook w:firstColumn="1" w:firstRow="1" w:lastColumn="0" w:lastRow="0" w:noHBand="0" w:noVBand="1" w:val="04A0"/>
+        <w:tblLayout w:type="fixed"/>
+        <w:tblW w:type="dxa" w:w="10466"/>
+        <w:tblInd w:type="dxa" w:w="0"/>
+        <w:jc w:val="center"/>
+        <w:tblBorders>
+          <w:top w:val="single" w:sz="4" w:space="0" w:color="2B547E"/>
+          <w:left w:val="single" w:sz="4" w:space="0" w:color="2B547E"/>
+          <w:bottom w:val="single" w:sz="4" w:space="0" w:color="2B547E"/>
+          <w:right w:val="single" w:sz="4" w:space="0" w:color="2B547E"/>
+          <w:insideH w:val="single" w:sz="4" w:space="0" w:color="2B547E"/>
+          <w:insideV w:val="single" w:sz="4" w:space="0" w:color="2B547E"/>
+        </w:tblBorders>
+      </w:tblPr>
+      <w:tblGrid>
+        <w:gridCol w:w="10466"/>
+      </w:tblGrid>
+      <w:tr>
+        <w:tc>
+          <w:tcPr>
+            <w:shd w:val="clear" w:color="auto" w:fill="2B547E"/>
+            <w:vAlign w:val="center"/>
+            <w:tcW w:type="dxa" w:w="10466"/>
+          </w:tcPr>
+          <w:p>
+            <w:pPr>
+              <w:spacing w:before="20" w:after="20"/>
+              <w:jc w:val="center"/>
+            </w:pPr>
+            <w:r/>
+            <w:r>
+              <w:rPr>
+                <w:rFonts w:ascii="Calibri" w:hAnsi="Calibri"/>
+                <w:b/>
+                <w:i w:val="0"/>
+                <w:color w:val="FFFFFF"/>
+                <w:sz w:val="16"/>
+              </w:rPr>
+              <w:t>Утврдува QA</w:t>
+            </w:r>
+            <w:r>
+              <w:rPr>
+                <w:rFonts w:ascii="Calibri" w:hAnsi="Calibri"/>
+                <w:b w:val="0"/>
+                <w:i w:val="0"/>
+                <w:color w:val="FFFFFF"/>
+                <w:sz w:val="14"/>
+              </w:rPr>
+              <w:t xml:space="preserve"> | </w:t>
+            </w:r>
+            <w:r>
+              <w:rPr>
+                <w:rFonts w:ascii="Calibri" w:hAnsi="Calibri"/>
+                <w:b w:val="0"/>
+                <w:i w:val="0"/>
+                <w:color w:val="FFFFFF"/>
+                <w:sz w:val="14"/>
+              </w:rPr>
+              <w:t>Determined by QA</w:t>
+            </w:r>
+          </w:p>
+        </w:tc>
+      </w:tr>
+      <w:tr>
+        <w:trPr>
+          <w:trHeight w:val="453" w:hRule="atLeast"/>
+        </w:trPr>
+        <w:tc>
+          <w:tcPr>
+            <w:vAlign w:val="center"/>
+            <w:tcW w:type="dxa" w:w="10466"/>
+          </w:tcPr>
+          <w:p>
+            <w:pPr>
+              <w:spacing w:before="20" w:after="20"/>
+              <w:jc w:val="center"/>
+            </w:pPr>
+            <w:r/>
+          </w:p>
+        </w:tc>
+      </w:tr>
+      <w:tr>
+        <w:trPr>
+          <w:trHeight w:val="453" w:hRule="atLeast"/>
+        </w:trPr>
+        <w:tc>
+          <w:tcPr>
+            <w:vAlign w:val="center"/>
+            <w:tcW w:type="dxa" w:w="10466"/>
+          </w:tcPr>
+          <w:p>
+            <w:pPr>
+              <w:spacing w:before="20" w:after="20"/>
+              <w:jc w:val="center"/>
+            </w:pPr>
+            <w:r/>
+          </w:p>
+        </w:tc>
+      </w:tr>
+      <w:tr>
+        <w:trPr>
+          <w:trHeight w:val="453" w:hRule="atLeast"/>
+        </w:trPr>
+        <w:tc>
+          <w:tcPr>
+            <w:vAlign w:val="center"/>
+            <w:tcW w:type="dxa" w:w="10466"/>
+          </w:tcPr>
+          <w:p>
+            <w:pPr>
+              <w:spacing w:before="20" w:after="20"/>
+              <w:jc w:val="center"/>
+            </w:pPr>
+            <w:r/>
+          </w:p>
+        </w:tc>
+      </w:tr>
+      <w:tr>
+        <w:trPr>
+          <w:trHeight w:val="453" w:hRule="atLeast"/>
+        </w:trPr>
+        <w:tc>
+          <w:tcPr>
+            <w:vAlign w:val="center"/>
+            <w:tcW w:type="dxa" w:w="10466"/>
+          </w:tcPr>
+          <w:p>
+            <w:pPr>
+              <w:spacing w:before="20" w:after="20"/>
+              <w:jc w:val="center"/>
+            </w:pPr>
+            <w:r/>
+          </w:p>
+        </w:tc>
+      </w:tr>
+    </w:tbl>
+    <w:p>
+      <w:pPr>
+        <w:keepNext/>
+        <w:spacing w:before="240" w:after="140"/>
+        <w:outlineLvl w:val="0"/>
+      </w:pPr>
+      <w:r>
+        <w:rPr>
+          <w:rFonts w:ascii="Calibri" w:hAnsi="Calibri"/>
+          <w:b/>
+          <w:i w:val="0"/>
+          <w:color w:val="2B547E"/>
+          <w:sz w:val="40"/>
+        </w:rPr>
+        <w:t>F.  КОРЕКТИВНИ И ПРЕВЕНТИВНИ ДЕЈСТВА (предлог)</w:t>
+      </w:r>
+      <w:r>
+        <w:rPr>
+          <w:rFonts w:ascii="Calibri" w:hAnsi="Calibri"/>
+          <w:b w:val="0"/>
+          <w:i w:val="0"/>
+          <w:color w:val="595959"/>
+          <w:sz w:val="36"/>
+        </w:rPr>
+        <w:t xml:space="preserve">  |  </w:t>
+      </w:r>
+      <w:r>
+        <w:rPr>
+          <w:rFonts w:ascii="Calibri" w:hAnsi="Calibri"/>
+          <w:b w:val="0"/>
+          <w:i w:val="0"/>
+          <w:color w:val="595959"/>
+          <w:sz w:val="32"/>
+        </w:rPr>
+        <w:t>Corrective and Preventive Actions (proposed)</w:t>
+      </w:r>
+    </w:p>
+    <w:tbl>
+      <w:tblPr>
+        <w:tblLook w:firstColumn="1" w:firstRow="1" w:lastColumn="0" w:lastRow="0" w:noHBand="0" w:noVBand="1" w:val="04A0"/>
+        <w:tblLayout w:type="fixed"/>
+        <w:tblW w:type="dxa" w:w="10466"/>
+        <w:tblInd w:type="dxa" w:w="0"/>
+        <w:jc w:val="center"/>
+        <w:tblBorders>
+          <w:top w:val="single" w:sz="4" w:space="0" w:color="2B547E"/>
+          <w:left w:val="single" w:sz="4" w:space="0" w:color="2B547E"/>
+          <w:bottom w:val="single" w:sz="4" w:space="0" w:color="2B547E"/>
+          <w:right w:val="single" w:sz="4" w:space="0" w:color="2B547E"/>
+          <w:insideH w:val="single" w:sz="4" w:space="0" w:color="2B547E"/>
+          <w:insideV w:val="single" w:sz="4" w:space="0" w:color="2B547E"/>
+        </w:tblBorders>
+      </w:tblPr>
+      <w:tblGrid>
+        <w:gridCol w:w="5216"/>
+        <w:gridCol w:w="1750"/>
+        <w:gridCol w:w="1750"/>
+        <w:gridCol w:w="1750"/>
+      </w:tblGrid>
+      <w:tr>
+        <w:tc>
+          <w:tcPr>
+            <w:shd w:val="clear" w:color="auto" w:fill="2B547E"/>
+            <w:vAlign w:val="center"/>
+            <w:tcW w:type="dxa" w:w="5216"/>
+          </w:tcPr>
+          <w:p>
+            <w:pPr>
+              <w:spacing w:before="20" w:after="20"/>
+              <w:jc w:val="center"/>
+            </w:pPr>
+            <w:r/>
+            <w:r>
+              <w:rPr>
+                <w:rFonts w:ascii="Calibri" w:hAnsi="Calibri"/>
+                <w:b/>
+                <w:i w:val="0"/>
+                <w:color w:val="FFFFFF"/>
+                <w:sz w:val="16"/>
+              </w:rPr>
+              <w:t>Дејство</w:t>
+            </w:r>
+            <w:r>
+              <w:rPr>
+                <w:rFonts w:ascii="Calibri" w:hAnsi="Calibri"/>
+                <w:b w:val="0"/>
+                <w:i w:val="0"/>
+                <w:color w:val="FFFFFF"/>
+                <w:sz w:val="14"/>
+              </w:rPr>
+              <w:t xml:space="preserve"> | </w:t>
+            </w:r>
+            <w:r>
+              <w:rPr>
+                <w:rFonts w:ascii="Calibri" w:hAnsi="Calibri"/>
+                <w:b w:val="0"/>
+                <w:i w:val="0"/>
+                <w:color w:val="FFFFFF"/>
+                <w:sz w:val="14"/>
+              </w:rPr>
+              <w:t>Action</w:t>
+            </w:r>
+          </w:p>
+        </w:tc>
+        <w:tc>
+          <w:tcPr>
+            <w:shd w:val="clear" w:color="auto" w:fill="2B547E"/>
+            <w:vAlign w:val="center"/>
+            <w:tcW w:type="dxa" w:w="1750"/>
+          </w:tcPr>
+          <w:p>
+            <w:pPr>
+              <w:spacing w:before="20" w:after="20"/>
+              <w:jc w:val="center"/>
+            </w:pPr>
+            <w:r/>
+            <w:r>
+              <w:rPr>
+                <w:rFonts w:ascii="Calibri" w:hAnsi="Calibri"/>
+                <w:b/>
+                <w:i w:val="0"/>
+                <w:color w:val="FFFFFF"/>
+                <w:sz w:val="16"/>
+              </w:rPr>
+              <w:t>Одговорен</w:t>
+            </w:r>
+            <w:r>
+              <w:rPr>
+                <w:rFonts w:ascii="Calibri" w:hAnsi="Calibri"/>
+                <w:b w:val="0"/>
+                <w:i w:val="0"/>
+                <w:color w:val="FFFFFF"/>
+                <w:sz w:val="14"/>
+              </w:rPr>
+              <w:t xml:space="preserve"> | </w:t>
+            </w:r>
+            <w:r>
+              <w:rPr>
+                <w:rFonts w:ascii="Calibri" w:hAnsi="Calibri"/>
+                <w:b w:val="0"/>
+                <w:i w:val="0"/>
+                <w:color w:val="FFFFFF"/>
+                <w:sz w:val="14"/>
+              </w:rPr>
+              <w:t>Responsible</w:t>
+            </w:r>
+          </w:p>
+        </w:tc>
+        <w:tc>
+          <w:tcPr>
+            <w:shd w:val="clear" w:color="auto" w:fill="2B547E"/>
+            <w:vAlign w:val="center"/>
+            <w:tcW w:type="dxa" w:w="1750"/>
+          </w:tcPr>
+          <w:p>
+            <w:pPr>
+              <w:spacing w:before="20" w:after="20"/>
+              <w:jc w:val="center"/>
+            </w:pPr>
+            <w:r/>
+            <w:r>
+              <w:rPr>
+                <w:rFonts w:ascii="Calibri" w:hAnsi="Calibri"/>
+                <w:b/>
+                <w:i w:val="0"/>
+                <w:color w:val="FFFFFF"/>
+                <w:sz w:val="16"/>
+              </w:rPr>
+              <w:t>Рок</w:t>
+            </w:r>
+            <w:r>
+              <w:rPr>
+                <w:rFonts w:ascii="Calibri" w:hAnsi="Calibri"/>
+                <w:b w:val="0"/>
+                <w:i w:val="0"/>
+                <w:color w:val="FFFFFF"/>
+                <w:sz w:val="14"/>
+              </w:rPr>
+              <w:t xml:space="preserve"> | </w:t>
+            </w:r>
+            <w:r>
+              <w:rPr>
+                <w:rFonts w:ascii="Calibri" w:hAnsi="Calibri"/>
+                <w:b w:val="0"/>
+                <w:i w:val="0"/>
+                <w:color w:val="FFFFFF"/>
+                <w:sz w:val="14"/>
+              </w:rPr>
+              <w:t>Due</w:t>
+            </w:r>
+          </w:p>
+        </w:tc>
+        <w:tc>
+          <w:tcPr>
+            <w:shd w:val="clear" w:color="auto" w:fill="2B547E"/>
+            <w:vAlign w:val="center"/>
+            <w:tcW w:type="dxa" w:w="1750"/>
+          </w:tcPr>
+          <w:p>
+            <w:pPr>
+              <w:spacing w:before="20" w:after="20"/>
+              <w:jc w:val="center"/>
+            </w:pPr>
+            <w:r/>
+            <w:r>
+              <w:rPr>
+                <w:rFonts w:ascii="Calibri" w:hAnsi="Calibri"/>
+                <w:b/>
+                <w:i w:val="0"/>
+                <w:color w:val="FFFFFF"/>
+                <w:sz w:val="16"/>
+              </w:rPr>
+              <w:t>Иниц.</w:t>
+            </w:r>
+            <w:r>
+              <w:rPr>
+                <w:rFonts w:ascii="Calibri" w:hAnsi="Calibri"/>
+                <w:b w:val="0"/>
+                <w:i w:val="0"/>
+                <w:color w:val="FFFFFF"/>
+                <w:sz w:val="14"/>
+              </w:rPr>
+              <w:t xml:space="preserve"> | </w:t>
+            </w:r>
+            <w:r>
+              <w:rPr>
+                <w:rFonts w:ascii="Calibri" w:hAnsi="Calibri"/>
+                <w:b w:val="0"/>
+                <w:i w:val="0"/>
+                <w:color w:val="FFFFFF"/>
+                <w:sz w:val="14"/>
+              </w:rPr>
+              <w:t>Init.</w:t>
+            </w:r>
+          </w:p>
+        </w:tc>
+      </w:tr>
+      <w:tr>
+        <w:trPr>
+          <w:trHeight w:val="453" w:hRule="atLeast"/>
+        </w:trPr>
+        <w:tc>
+          <w:tcPr>
+            <w:vAlign w:val="center"/>
+            <w:tcW w:type="dxa" w:w="5216"/>
+          </w:tcPr>
+          <w:p>
+            <w:pPr>
+              <w:spacing w:before="20" w:after="20"/>
+              <w:jc w:val="left"/>
+            </w:pPr>
+            <w:r/>
+            <w:r>
+              <w:rPr>
+                <w:rFonts w:ascii="Calibri" w:hAnsi="Calibri"/>
+                <w:b w:val="0"/>
+                <w:i w:val="0"/>
+                <w:color w:val="000000"/>
+                <w:sz w:val="16"/>
+              </w:rPr>
+              <w:t>[ ] Работна картичка за a02.2 на работното место што ја именува AUW220D</w:t>
+            </w:r>
+            <w:r>
+              <w:rPr>
+                <w:rFonts w:ascii="Calibri" w:hAnsi="Calibri"/>
+                <w:b w:val="0"/>
+                <w:i w:val="0"/>
+                <w:color w:val="000000"/>
+                <w:sz w:val="14"/>
+              </w:rPr>
+              <w:t xml:space="preserve"> | </w:t>
+            </w:r>
+            <w:r>
+              <w:rPr>
+                <w:rFonts w:ascii="Calibri" w:hAnsi="Calibri"/>
+                <w:b w:val="0"/>
+                <w:i/>
+                <w:color w:val="000000"/>
+                <w:sz w:val="14"/>
+              </w:rPr>
+              <w:t>Bench card for a02.2 naming the AUW220D</w:t>
+            </w:r>
+          </w:p>
+        </w:tc>
+        <w:tc>
+          <w:tcPr>
+            <w:vAlign w:val="center"/>
+            <w:tcW w:type="dxa" w:w="1750"/>
+          </w:tcPr>
+          <w:p>
+            <w:pPr>
+              <w:spacing w:before="20" w:after="20"/>
+              <w:jc w:val="center"/>
+            </w:pPr>
+            <w:r/>
+          </w:p>
+        </w:tc>
+        <w:tc>
+          <w:tcPr>
+            <w:vAlign w:val="center"/>
+            <w:tcW w:type="dxa" w:w="1750"/>
+          </w:tcPr>
+          <w:p>
+            <w:pPr>
+              <w:spacing w:before="20" w:after="20"/>
+              <w:jc w:val="center"/>
+            </w:pPr>
+            <w:r/>
+          </w:p>
+        </w:tc>
+        <w:tc>
+          <w:tcPr>
+            <w:vAlign w:val="center"/>
+            <w:tcW w:type="dxa" w:w="1750"/>
+          </w:tcPr>
+          <w:p>
+            <w:pPr>
+              <w:spacing w:before="20" w:after="20"/>
+              <w:jc w:val="center"/>
+            </w:pPr>
+            <w:r/>
+          </w:p>
+        </w:tc>
+      </w:tr>
+      <w:tr>
+        <w:trPr>
+          <w:trHeight w:val="453" w:hRule="atLeast"/>
+        </w:trPr>
+        <w:tc>
+          <w:tcPr>
+            <w:vAlign w:val="center"/>
+            <w:tcW w:type="dxa" w:w="5216"/>
+          </w:tcPr>
+          <w:p>
+            <w:pPr>
+              <w:spacing w:before="20" w:after="20"/>
+              <w:jc w:val="left"/>
+            </w:pPr>
+            <w:r/>
+            <w:r>
+              <w:rPr>
+                <w:rFonts w:ascii="Calibri" w:hAnsi="Calibri"/>
+                <w:b w:val="0"/>
+                <w:i w:val="0"/>
+                <w:color w:val="000000"/>
+                <w:sz w:val="16"/>
+              </w:rPr>
+              <w:t>[ ] Ознака на прецизната вага: не за аналитичко мерење</w:t>
+            </w:r>
+            <w:r>
+              <w:rPr>
+                <w:rFonts w:ascii="Calibri" w:hAnsi="Calibri"/>
+                <w:b w:val="0"/>
+                <w:i w:val="0"/>
+                <w:color w:val="000000"/>
+                <w:sz w:val="14"/>
+              </w:rPr>
+              <w:t xml:space="preserve"> | </w:t>
+            </w:r>
+            <w:r>
+              <w:rPr>
+                <w:rFonts w:ascii="Calibri" w:hAnsi="Calibri"/>
+                <w:b w:val="0"/>
+                <w:i/>
+                <w:color w:val="000000"/>
+                <w:sz w:val="14"/>
+              </w:rPr>
+              <w:t>Label on the precision balance: not for analytical weighing</w:t>
+            </w:r>
+          </w:p>
+        </w:tc>
+        <w:tc>
+          <w:tcPr>
+            <w:vAlign w:val="center"/>
+            <w:tcW w:type="dxa" w:w="1750"/>
+          </w:tcPr>
+          <w:p>
+            <w:pPr>
+              <w:spacing w:before="20" w:after="20"/>
+              <w:jc w:val="center"/>
+            </w:pPr>
+            <w:r/>
+          </w:p>
+        </w:tc>
+        <w:tc>
+          <w:tcPr>
+            <w:vAlign w:val="center"/>
+            <w:tcW w:type="dxa" w:w="1750"/>
+          </w:tcPr>
+          <w:p>
+            <w:pPr>
+              <w:spacing w:before="20" w:after="20"/>
+              <w:jc w:val="center"/>
+            </w:pPr>
+            <w:r/>
+          </w:p>
+        </w:tc>
+        <w:tc>
+          <w:tcPr>
+            <w:vAlign w:val="center"/>
+            <w:tcW w:type="dxa" w:w="1750"/>
+          </w:tcPr>
+          <w:p>
+            <w:pPr>
+              <w:spacing w:before="20" w:after="20"/>
+              <w:jc w:val="center"/>
+            </w:pPr>
+            <w:r/>
+          </w:p>
+        </w:tc>
+      </w:tr>
+      <w:tr>
+        <w:trPr>
+          <w:trHeight w:val="453" w:hRule="atLeast"/>
+        </w:trPr>
+        <w:tc>
+          <w:tcPr>
+            <w:vAlign w:val="center"/>
+            <w:tcW w:type="dxa" w:w="5216"/>
+          </w:tcPr>
+          <w:p>
+            <w:pPr>
+              <w:spacing w:before="20" w:after="20"/>
+              <w:jc w:val="left"/>
+            </w:pPr>
+            <w:r/>
+            <w:r>
+              <w:rPr>
+                <w:rFonts w:ascii="Calibri" w:hAnsi="Calibri"/>
+                <w:b w:val="0"/>
+                <w:i w:val="0"/>
+                <w:color w:val="000000"/>
+                <w:sz w:val="16"/>
+              </w:rPr>
+              <w:t>[ ] Обука за a02.2 и QCWI 016</w:t>
+            </w:r>
+            <w:r>
+              <w:rPr>
+                <w:rFonts w:ascii="Calibri" w:hAnsi="Calibri"/>
+                <w:b w:val="0"/>
+                <w:i w:val="0"/>
+                <w:color w:val="000000"/>
+                <w:sz w:val="14"/>
+              </w:rPr>
+              <w:t xml:space="preserve"> | </w:t>
+            </w:r>
+            <w:r>
+              <w:rPr>
+                <w:rFonts w:ascii="Calibri" w:hAnsi="Calibri"/>
+                <w:b w:val="0"/>
+                <w:i/>
+                <w:color w:val="000000"/>
+                <w:sz w:val="14"/>
+              </w:rPr>
+              <w:t>Training on a02.2 and QCWI 016</w:t>
+            </w:r>
+          </w:p>
+        </w:tc>
+        <w:tc>
+          <w:tcPr>
+            <w:vAlign w:val="center"/>
+            <w:tcW w:type="dxa" w:w="1750"/>
+          </w:tcPr>
+          <w:p>
+            <w:pPr>
+              <w:spacing w:before="20" w:after="20"/>
+              <w:jc w:val="center"/>
+            </w:pPr>
+            <w:r/>
+          </w:p>
+        </w:tc>
+        <w:tc>
+          <w:tcPr>
+            <w:vAlign w:val="center"/>
+            <w:tcW w:type="dxa" w:w="1750"/>
+          </w:tcPr>
+          <w:p>
+            <w:pPr>
+              <w:spacing w:before="20" w:after="20"/>
+              <w:jc w:val="center"/>
+            </w:pPr>
+            <w:r/>
+          </w:p>
+        </w:tc>
+        <w:tc>
+          <w:tcPr>
+            <w:vAlign w:val="center"/>
+            <w:tcW w:type="dxa" w:w="1750"/>
+          </w:tcPr>
+          <w:p>
+            <w:pPr>
+              <w:spacing w:before="20" w:after="20"/>
+              <w:jc w:val="center"/>
+            </w:pPr>
+            <w:r/>
+          </w:p>
+        </w:tc>
+      </w:tr>
+      <w:tr>
+        <w:trPr>
+          <w:trHeight w:val="453" w:hRule="atLeast"/>
+        </w:trPr>
+        <w:tc>
+          <w:tcPr>
+            <w:vAlign w:val="center"/>
+            <w:tcW w:type="dxa" w:w="5216"/>
+          </w:tcPr>
+          <w:p>
+            <w:pPr>
+              <w:spacing w:before="20" w:after="20"/>
+              <w:jc w:val="left"/>
+            </w:pPr>
+            <w:r/>
+            <w:r>
+              <w:rPr>
+                <w:rFonts w:ascii="Calibri" w:hAnsi="Calibri"/>
+                <w:b w:val="0"/>
+                <w:i w:val="0"/>
+                <w:color w:val="000000"/>
+                <w:sz w:val="16"/>
+              </w:rPr>
+              <w:t>[ ] Друго</w:t>
+            </w:r>
+            <w:r>
+              <w:rPr>
+                <w:rFonts w:ascii="Calibri" w:hAnsi="Calibri"/>
+                <w:b w:val="0"/>
+                <w:i w:val="0"/>
+                <w:color w:val="000000"/>
+                <w:sz w:val="14"/>
+              </w:rPr>
+              <w:t xml:space="preserve"> | </w:t>
+            </w:r>
+            <w:r>
+              <w:rPr>
+                <w:rFonts w:ascii="Calibri" w:hAnsi="Calibri"/>
+                <w:b w:val="0"/>
+                <w:i/>
+                <w:color w:val="000000"/>
+                <w:sz w:val="14"/>
+              </w:rPr>
+              <w:t>Other: ____________</w:t>
+            </w:r>
+          </w:p>
+        </w:tc>
+        <w:tc>
+          <w:tcPr>
+            <w:vAlign w:val="center"/>
+            <w:tcW w:type="dxa" w:w="1750"/>
+          </w:tcPr>
+          <w:p>
+            <w:pPr>
+              <w:spacing w:before="20" w:after="20"/>
+              <w:jc w:val="center"/>
+            </w:pPr>
+            <w:r/>
+          </w:p>
+        </w:tc>
+        <w:tc>
+          <w:tcPr>
+            <w:vAlign w:val="center"/>
+            <w:tcW w:type="dxa" w:w="1750"/>
+          </w:tcPr>
+          <w:p>
+            <w:pPr>
+              <w:spacing w:before="20" w:after="20"/>
+              <w:jc w:val="center"/>
+            </w:pPr>
+            <w:r/>
+          </w:p>
+        </w:tc>
+        <w:tc>
+          <w:tcPr>
+            <w:vAlign w:val="center"/>
+            <w:tcW w:type="dxa" w:w="1750"/>
+          </w:tcPr>
+          <w:p>
+            <w:pPr>
+              <w:spacing w:before="20" w:after="20"/>
+              <w:jc w:val="center"/>
+            </w:pPr>
+            <w:r/>
+          </w:p>
+        </w:tc>
+      </w:tr>
+    </w:tbl>
+    <w:p>
+      <w:pPr>
+        <w:keepNext/>
+        <w:spacing w:before="240" w:after="140"/>
+        <w:outlineLvl w:val="0"/>
+      </w:pPr>
+      <w:r>
+        <w:rPr>
+          <w:rFonts w:ascii="Calibri" w:hAnsi="Calibri"/>
+          <w:b/>
+          <w:i w:val="0"/>
+          <w:color w:val="2B547E"/>
+          <w:sz w:val="40"/>
+        </w:rPr>
+        <w:t>G.  КЛАСИФИКАЦИЈА И ЗАТВОРАЊЕ</w:t>
+      </w:r>
+      <w:r>
+        <w:rPr>
+          <w:rFonts w:ascii="Calibri" w:hAnsi="Calibri"/>
+          <w:b w:val="0"/>
+          <w:i w:val="0"/>
+          <w:color w:val="595959"/>
+          <w:sz w:val="36"/>
+        </w:rPr>
+        <w:t xml:space="preserve">  |  </w:t>
+      </w:r>
+      <w:r>
+        <w:rPr>
+          <w:rFonts w:ascii="Calibri" w:hAnsi="Calibri"/>
+          <w:b w:val="0"/>
+          <w:i w:val="0"/>
+          <w:color w:val="595959"/>
+          <w:sz w:val="32"/>
+        </w:rPr>
+        <w:t>Classification and Closure</w:t>
+      </w:r>
+    </w:p>
+    <w:tbl>
+      <w:tblPr>
+        <w:tblLook w:firstColumn="1" w:firstRow="1" w:lastColumn="0" w:lastRow="0" w:noHBand="0" w:noVBand="1" w:val="04A0"/>
+        <w:tblLayout w:type="fixed"/>
+        <w:tblW w:type="dxa" w:w="10466"/>
+        <w:tblInd w:type="dxa" w:w="0"/>
+        <w:jc w:val="center"/>
+        <w:tblBorders>
+          <w:top w:val="single" w:sz="4" w:space="0" w:color="2B547E"/>
+          <w:left w:val="single" w:sz="4" w:space="0" w:color="2B547E"/>
+          <w:bottom w:val="single" w:sz="4" w:space="0" w:color="2B547E"/>
+          <w:right w:val="single" w:sz="4" w:space="0" w:color="2B547E"/>
+          <w:insideH w:val="single" w:sz="4" w:space="0" w:color="2B547E"/>
+          <w:insideV w:val="single" w:sz="4" w:space="0" w:color="2B547E"/>
+        </w:tblBorders>
+      </w:tblPr>
+      <w:tblGrid>
+        <w:gridCol w:w="3515"/>
+        <w:gridCol w:w="6951"/>
+      </w:tblGrid>
+      <w:tr>
+        <w:trPr>
+          <w:tblHeader w:val="true"/>
+        </w:trPr>
+        <w:tc>
+          <w:tcPr>
             <w:shd w:val="clear" w:color="auto" w:fill="F2F2F2"/>
             <w:vAlign w:val="center"/>
             <w:tcW w:type="dxa" w:w="3515"/>
@@ -3681,7 +4175,7 @@
                 <w:color w:val="000000"/>
                 <w:sz w:val="18"/>
               </w:rPr>
-              <w:t>Резултати по правилото во делот D</w:t>
+              <w:t>Класификација (QA)</w:t>
             </w:r>
             <w:r>
               <w:rPr>
@@ -3701,7 +4195,7 @@
                 <w:color w:val="000000"/>
                 <w:sz w:val="14"/>
               </w:rPr>
-              <w:t>Results under the rule in section D</w:t>
+              <w:t>Classification (QA)</w:t>
             </w:r>
           </w:p>
         </w:tc>
@@ -3724,6 +4218,95 @@
                 <w:color w:val="000000"/>
                 <w:sz w:val="18"/>
               </w:rPr>
+              <w:t>[ ] мало</w:t>
+            </w:r>
+            <w:r>
+              <w:rPr>
+                <w:rFonts w:ascii="Calibri" w:hAnsi="Calibri"/>
+                <w:b w:val="0"/>
+                <w:i w:val="0"/>
+                <w:color w:val="000000"/>
+                <w:sz w:val="14"/>
+              </w:rPr>
+              <w:t xml:space="preserve"> | </w:t>
+            </w:r>
+            <w:r>
+              <w:rPr>
+                <w:rFonts w:ascii="Calibri" w:hAnsi="Calibri"/>
+                <w:b w:val="0"/>
+                <w:i/>
+                <w:color w:val="000000"/>
+                <w:sz w:val="14"/>
+              </w:rPr>
+              <w:t>minor   [ ] големо | major   [ ] критично | critical</w:t>
+            </w:r>
+          </w:p>
+        </w:tc>
+      </w:tr>
+      <w:tr>
+        <w:tc>
+          <w:tcPr>
+            <w:shd w:val="clear" w:color="auto" w:fill="F2F2F2"/>
+            <w:vAlign w:val="center"/>
+            <w:tcW w:type="dxa" w:w="3515"/>
+          </w:tcPr>
+          <w:p>
+            <w:pPr>
+              <w:spacing w:before="20" w:after="20"/>
+              <w:jc w:val="center"/>
+            </w:pPr>
+            <w:r/>
+            <w:r>
+              <w:rPr>
+                <w:rFonts w:ascii="Calibri" w:hAnsi="Calibri"/>
+                <w:b/>
+                <w:i w:val="0"/>
+                <w:color w:val="000000"/>
+                <w:sz w:val="18"/>
+              </w:rPr>
+              <w:t>Резултати од PP-QC-SP-002/26-LOD-01R</w:t>
+            </w:r>
+            <w:r>
+              <w:rPr>
+                <w:rFonts w:ascii="Calibri" w:hAnsi="Calibri"/>
+                <w:b w:val="0"/>
+                <w:i w:val="0"/>
+                <w:color w:val="000000"/>
+                <w:sz w:val="14"/>
+              </w:rPr>
+              <w:t xml:space="preserve"> | </w:t>
+            </w:r>
+            <w:r>
+              <w:rPr>
+                <w:rFonts w:ascii="Calibri" w:hAnsi="Calibri"/>
+                <w:b w:val="0"/>
+                <w:i w:val="0"/>
+                <w:color w:val="000000"/>
+                <w:sz w:val="14"/>
+              </w:rPr>
+              <w:t>Results from PP-QC-SP-002/26-LOD-01R</w:t>
+            </w:r>
+          </w:p>
+        </w:tc>
+        <w:tc>
+          <w:tcPr>
+            <w:vAlign w:val="center"/>
+            <w:tcW w:type="dxa" w:w="6951"/>
+          </w:tcPr>
+          <w:p>
+            <w:pPr>
+              <w:spacing w:before="20" w:after="20"/>
+              <w:jc w:val="center"/>
+            </w:pPr>
+            <w:r/>
+            <w:r>
+              <w:rPr>
+                <w:rFonts w:ascii="Calibri" w:hAnsi="Calibri"/>
+                <w:b w:val="0"/>
+                <w:i w:val="0"/>
+                <w:color w:val="000000"/>
+                <w:sz w:val="18"/>
+              </w:rPr>
               <w:t>одговара</w:t>
             </w:r>
             <w:r>
@@ -3744,7 +4327,7 @@
                 <w:color w:val="000000"/>
                 <w:sz w:val="14"/>
               </w:rPr>
-              <w:t>conform: ____   повторени | repeated: ____   OOS: ____</w:t>
+              <w:t>conform: ____   OOS: ____</w:t>
             </w:r>
           </w:p>
         </w:tc>

</xml_diff>